<commit_message>
atualização dicionario atividade 9
</commit_message>
<xml_diff>
--- a/ativida_9_em_grupo/Diagramas_do_BD_Scripts_do_Projeto_PI.docx
+++ b/ativida_9_em_grupo/Diagramas_do_BD_Scripts_do_Projeto_PI.docx
@@ -606,6 +606,7 @@
       <w:r>
         <w:rPr>
           <w:rFonts w:ascii="Arial" w:eastAsia="Arial" w:hAnsi="Arial" w:cs="Arial"/>
+          <w:noProof/>
           <w:lang w:val="pt"/>
         </w:rPr>
         <w:drawing>
@@ -787,6 +788,7 @@
       <w:r>
         <w:rPr>
           <w:rFonts w:ascii="Arial" w:eastAsia="Arial" w:hAnsi="Arial" w:cs="Arial"/>
+          <w:noProof/>
           <w:lang w:val="pt"/>
         </w:rPr>
         <w:drawing>
@@ -826,6 +828,2945 @@
         </w:drawing>
       </w:r>
     </w:p>
+    <w:p>
+      <w:pPr>
+        <w:rPr>
+          <w:rFonts w:ascii="Arial" w:eastAsia="Arial" w:hAnsi="Arial" w:cs="Arial"/>
+          <w:lang w:val="pt"/>
+        </w:rPr>
+      </w:pPr>
+    </w:p>
+    <w:p>
+      <w:pPr>
+        <w:rPr>
+          <w:rFonts w:ascii="Arial" w:eastAsia="Arial" w:hAnsi="Arial" w:cs="Arial"/>
+          <w:lang w:val="pt"/>
+        </w:rPr>
+      </w:pPr>
+    </w:p>
+    <w:p>
+      <w:pPr>
+        <w:rPr>
+          <w:rFonts w:ascii="Arial" w:eastAsia="Arial" w:hAnsi="Arial" w:cs="Arial"/>
+          <w:lang w:val="pt"/>
+        </w:rPr>
+      </w:pPr>
+    </w:p>
+    <w:p>
+      <w:pPr>
+        <w:rPr>
+          <w:rFonts w:ascii="Arial" w:eastAsia="Arial" w:hAnsi="Arial" w:cs="Arial"/>
+          <w:lang w:val="pt"/>
+        </w:rPr>
+      </w:pPr>
+    </w:p>
+    <w:p>
+      <w:pPr>
+        <w:rPr>
+          <w:rFonts w:ascii="Arial" w:eastAsia="Arial" w:hAnsi="Arial" w:cs="Arial"/>
+          <w:lang w:val="pt"/>
+        </w:rPr>
+      </w:pPr>
+    </w:p>
+    <w:p>
+      <w:pPr>
+        <w:rPr>
+          <w:rFonts w:ascii="Arial" w:eastAsia="Arial" w:hAnsi="Arial" w:cs="Arial"/>
+          <w:lang w:val="pt"/>
+        </w:rPr>
+      </w:pPr>
+    </w:p>
+    <w:p>
+      <w:pPr>
+        <w:rPr>
+          <w:rFonts w:ascii="Arial" w:eastAsia="Arial" w:hAnsi="Arial" w:cs="Arial"/>
+          <w:lang w:val="pt"/>
+        </w:rPr>
+      </w:pPr>
+    </w:p>
+    <w:p>
+      <w:pPr>
+        <w:rPr>
+          <w:rFonts w:ascii="Arial" w:eastAsia="Arial" w:hAnsi="Arial" w:cs="Arial"/>
+          <w:lang w:val="pt"/>
+        </w:rPr>
+      </w:pPr>
+    </w:p>
+    <w:p>
+      <w:pPr>
+        <w:rPr>
+          <w:rFonts w:ascii="Arial" w:eastAsia="Arial" w:hAnsi="Arial" w:cs="Arial"/>
+          <w:lang w:val="pt"/>
+        </w:rPr>
+      </w:pPr>
+    </w:p>
+    <w:p>
+      <w:pPr>
+        <w:rPr>
+          <w:rFonts w:ascii="Arial" w:eastAsia="Arial" w:hAnsi="Arial" w:cs="Arial"/>
+          <w:lang w:val="pt"/>
+        </w:rPr>
+      </w:pPr>
+    </w:p>
+    <w:p>
+      <w:pPr>
+        <w:rPr>
+          <w:rFonts w:ascii="Arial" w:eastAsia="Arial" w:hAnsi="Arial" w:cs="Arial"/>
+          <w:lang w:val="pt"/>
+        </w:rPr>
+      </w:pPr>
+    </w:p>
+    <w:p>
+      <w:pPr>
+        <w:rPr>
+          <w:rFonts w:ascii="Arial" w:eastAsia="Arial" w:hAnsi="Arial" w:cs="Arial"/>
+          <w:lang w:val="pt"/>
+        </w:rPr>
+      </w:pPr>
+    </w:p>
+    <w:p>
+      <w:pPr>
+        <w:rPr>
+          <w:rFonts w:ascii="Arial" w:eastAsia="Arial" w:hAnsi="Arial" w:cs="Arial"/>
+          <w:lang w:val="pt"/>
+        </w:rPr>
+      </w:pPr>
+    </w:p>
+    <w:p>
+      <w:pPr>
+        <w:rPr>
+          <w:rFonts w:ascii="Arial" w:eastAsia="Arial" w:hAnsi="Arial" w:cs="Arial"/>
+          <w:lang w:val="pt"/>
+        </w:rPr>
+      </w:pPr>
+    </w:p>
+    <w:p>
+      <w:pPr>
+        <w:rPr>
+          <w:rFonts w:ascii="Arial" w:eastAsia="Arial" w:hAnsi="Arial" w:cs="Arial"/>
+          <w:lang w:val="pt"/>
+        </w:rPr>
+      </w:pPr>
+    </w:p>
+    <w:p>
+      <w:pPr>
+        <w:rPr>
+          <w:rFonts w:ascii="Arial" w:eastAsia="Arial" w:hAnsi="Arial" w:cs="Arial"/>
+          <w:lang w:val="pt"/>
+        </w:rPr>
+      </w:pPr>
+    </w:p>
+    <w:p>
+      <w:pPr>
+        <w:rPr>
+          <w:rFonts w:ascii="Arial" w:eastAsia="Arial" w:hAnsi="Arial" w:cs="Arial"/>
+          <w:lang w:val="pt"/>
+        </w:rPr>
+      </w:pPr>
+      <w:r>
+        <w:rPr>
+          <w:rFonts w:ascii="Arial" w:eastAsia="Arial" w:hAnsi="Arial" w:cs="Arial"/>
+          <w:lang w:val="pt"/>
+        </w:rPr>
+        <w:lastRenderedPageBreak/>
+        <w:t>Dicionári</w:t>
+      </w:r>
+      <w:r>
+        <w:rPr>
+          <w:rFonts w:ascii="Arial" w:eastAsia="Arial" w:hAnsi="Arial" w:cs="Arial"/>
+          <w:lang w:val="pt"/>
+        </w:rPr>
+        <w:t xml:space="preserve">o </w:t>
+      </w:r>
+      <w:r>
+        <w:rPr>
+          <w:rFonts w:ascii="Arial" w:eastAsia="Arial" w:hAnsi="Arial" w:cs="Arial"/>
+          <w:lang w:val="pt"/>
+        </w:rPr>
+        <w:t>- Cliente</w:t>
+      </w:r>
+    </w:p>
+    <w:tbl>
+      <w:tblPr>
+        <w:tblStyle w:val="Tabelacomgrade"/>
+        <w:tblW w:w="10357" w:type="dxa"/>
+        <w:tblInd w:w="-868" w:type="dxa"/>
+        <w:tblLook w:val="04A0" w:firstRow="1" w:lastRow="0" w:firstColumn="1" w:lastColumn="0" w:noHBand="0" w:noVBand="1"/>
+      </w:tblPr>
+      <w:tblGrid>
+        <w:gridCol w:w="2778"/>
+        <w:gridCol w:w="2645"/>
+        <w:gridCol w:w="1083"/>
+        <w:gridCol w:w="1283"/>
+        <w:gridCol w:w="1417"/>
+        <w:gridCol w:w="1310"/>
+      </w:tblGrid>
+      <w:tr>
+        <w:tc>
+          <w:tcPr>
+            <w:tcW w:w="2645" w:type="dxa"/>
+          </w:tcPr>
+          <w:p>
+            <w:pPr>
+              <w:jc w:val="center"/>
+              <w:rPr>
+                <w:rFonts w:ascii="Arial" w:eastAsia="Arial" w:hAnsi="Arial" w:cs="Arial"/>
+                <w:b/>
+                <w:bCs/>
+                <w:lang w:val="pt"/>
+              </w:rPr>
+            </w:pPr>
+            <w:r>
+              <w:rPr>
+                <w:rFonts w:ascii="Arial" w:eastAsia="Arial" w:hAnsi="Arial" w:cs="Arial"/>
+                <w:b/>
+                <w:bCs/>
+                <w:lang w:val="pt"/>
+              </w:rPr>
+              <w:t>Atributo</w:t>
+            </w:r>
+          </w:p>
+        </w:tc>
+        <w:tc>
+          <w:tcPr>
+            <w:tcW w:w="2645" w:type="dxa"/>
+          </w:tcPr>
+          <w:p>
+            <w:pPr>
+              <w:jc w:val="center"/>
+              <w:rPr>
+                <w:rFonts w:ascii="Arial" w:eastAsia="Arial" w:hAnsi="Arial" w:cs="Arial"/>
+                <w:b/>
+                <w:bCs/>
+                <w:lang w:val="pt"/>
+              </w:rPr>
+            </w:pPr>
+            <w:r>
+              <w:rPr>
+                <w:rFonts w:ascii="Arial" w:eastAsia="Arial" w:hAnsi="Arial" w:cs="Arial"/>
+                <w:b/>
+                <w:bCs/>
+                <w:lang w:val="pt"/>
+              </w:rPr>
+              <w:t>Campo</w:t>
+            </w:r>
+          </w:p>
+        </w:tc>
+        <w:tc>
+          <w:tcPr>
+            <w:tcW w:w="1057" w:type="dxa"/>
+          </w:tcPr>
+          <w:p>
+            <w:pPr>
+              <w:jc w:val="center"/>
+              <w:rPr>
+                <w:rFonts w:ascii="Arial" w:eastAsia="Arial" w:hAnsi="Arial" w:cs="Arial"/>
+                <w:b/>
+                <w:bCs/>
+                <w:lang w:val="pt"/>
+              </w:rPr>
+            </w:pPr>
+            <w:r>
+              <w:rPr>
+                <w:rFonts w:ascii="Arial" w:eastAsia="Arial" w:hAnsi="Arial" w:cs="Arial"/>
+                <w:b/>
+                <w:bCs/>
+                <w:lang w:val="pt"/>
+              </w:rPr>
+              <w:t>Tipo de dados</w:t>
+            </w:r>
+          </w:p>
+        </w:tc>
+        <w:tc>
+          <w:tcPr>
+            <w:tcW w:w="1283" w:type="dxa"/>
+          </w:tcPr>
+          <w:p>
+            <w:pPr>
+              <w:jc w:val="center"/>
+              <w:rPr>
+                <w:rFonts w:ascii="Arial" w:eastAsia="Arial" w:hAnsi="Arial" w:cs="Arial"/>
+                <w:b/>
+                <w:bCs/>
+                <w:lang w:val="pt"/>
+              </w:rPr>
+            </w:pPr>
+            <w:r>
+              <w:rPr>
+                <w:rFonts w:ascii="Arial" w:eastAsia="Arial" w:hAnsi="Arial" w:cs="Arial"/>
+                <w:b/>
+                <w:bCs/>
+                <w:lang w:val="pt"/>
+              </w:rPr>
+              <w:t>Tamanho</w:t>
+            </w:r>
+          </w:p>
+        </w:tc>
+        <w:tc>
+          <w:tcPr>
+            <w:tcW w:w="1417" w:type="dxa"/>
+          </w:tcPr>
+          <w:p>
+            <w:pPr>
+              <w:jc w:val="center"/>
+              <w:rPr>
+                <w:rFonts w:ascii="Arial" w:eastAsia="Arial" w:hAnsi="Arial" w:cs="Arial"/>
+                <w:b/>
+                <w:bCs/>
+                <w:lang w:val="pt"/>
+              </w:rPr>
+            </w:pPr>
+            <w:r>
+              <w:rPr>
+                <w:rFonts w:ascii="Arial" w:eastAsia="Arial" w:hAnsi="Arial" w:cs="Arial"/>
+                <w:b/>
+                <w:bCs/>
+                <w:lang w:val="pt"/>
+              </w:rPr>
+              <w:t>Descrição</w:t>
+            </w:r>
+          </w:p>
+        </w:tc>
+        <w:tc>
+          <w:tcPr>
+            <w:tcW w:w="1310" w:type="dxa"/>
+          </w:tcPr>
+          <w:p>
+            <w:pPr>
+              <w:jc w:val="center"/>
+              <w:rPr>
+                <w:rFonts w:ascii="Arial" w:eastAsia="Arial" w:hAnsi="Arial" w:cs="Arial"/>
+                <w:b/>
+                <w:bCs/>
+                <w:lang w:val="pt"/>
+              </w:rPr>
+            </w:pPr>
+            <w:r>
+              <w:rPr>
+                <w:rFonts w:ascii="Arial" w:eastAsia="Arial" w:hAnsi="Arial" w:cs="Arial"/>
+                <w:b/>
+                <w:bCs/>
+                <w:lang w:val="pt"/>
+              </w:rPr>
+              <w:t>Restrição</w:t>
+            </w:r>
+          </w:p>
+        </w:tc>
+      </w:tr>
+      <w:tr>
+        <w:tc>
+          <w:tcPr>
+            <w:tcW w:w="2645" w:type="dxa"/>
+          </w:tcPr>
+          <w:p>
+            <w:pPr>
+              <w:rPr>
+                <w:rFonts w:ascii="Arial" w:eastAsia="Arial" w:hAnsi="Arial" w:cs="Arial"/>
+                <w:lang w:val="pt"/>
+              </w:rPr>
+            </w:pPr>
+            <w:proofErr w:type="spellStart"/>
+            <w:r>
+              <w:rPr>
+                <w:rFonts w:ascii="Arial" w:eastAsia="Arial" w:hAnsi="Arial" w:cs="Arial"/>
+                <w:lang w:val="pt"/>
+              </w:rPr>
+              <w:t>ID_cliente</w:t>
+            </w:r>
+            <w:proofErr w:type="spellEnd"/>
+          </w:p>
+        </w:tc>
+        <w:tc>
+          <w:tcPr>
+            <w:tcW w:w="2645" w:type="dxa"/>
+          </w:tcPr>
+          <w:p>
+            <w:pPr>
+              <w:rPr>
+                <w:rFonts w:ascii="Arial" w:eastAsia="Arial" w:hAnsi="Arial" w:cs="Arial"/>
+                <w:lang w:val="pt"/>
+              </w:rPr>
+            </w:pPr>
+            <w:r>
+              <w:rPr>
+                <w:rFonts w:ascii="Arial" w:eastAsia="Arial" w:hAnsi="Arial" w:cs="Arial"/>
+                <w:lang w:val="pt"/>
+              </w:rPr>
+              <w:t>_</w:t>
+            </w:r>
+            <w:proofErr w:type="spellStart"/>
+            <w:r>
+              <w:rPr>
+                <w:rFonts w:ascii="Arial" w:eastAsia="Arial" w:hAnsi="Arial" w:cs="Arial"/>
+                <w:lang w:val="pt"/>
+              </w:rPr>
+              <w:t>ID_</w:t>
+            </w:r>
+            <w:r>
+              <w:rPr>
+                <w:rFonts w:ascii="Arial" w:eastAsia="Arial" w:hAnsi="Arial" w:cs="Arial"/>
+                <w:lang w:val="pt"/>
+              </w:rPr>
+              <w:t>cliente</w:t>
+            </w:r>
+            <w:proofErr w:type="spellEnd"/>
+          </w:p>
+        </w:tc>
+        <w:tc>
+          <w:tcPr>
+            <w:tcW w:w="1057" w:type="dxa"/>
+          </w:tcPr>
+          <w:p>
+            <w:pPr>
+              <w:rPr>
+                <w:rFonts w:ascii="Arial" w:eastAsia="Arial" w:hAnsi="Arial" w:cs="Arial"/>
+                <w:lang w:val="pt"/>
+              </w:rPr>
+            </w:pPr>
+            <w:r>
+              <w:rPr>
+                <w:rFonts w:ascii="Arial" w:eastAsia="Arial" w:hAnsi="Arial" w:cs="Arial"/>
+                <w:lang w:val="pt"/>
+              </w:rPr>
+              <w:t>C</w:t>
+            </w:r>
+            <w:r>
+              <w:rPr>
+                <w:rFonts w:ascii="Arial" w:eastAsia="Arial" w:hAnsi="Arial" w:cs="Arial"/>
+                <w:lang w:val="pt"/>
+              </w:rPr>
+              <w:t>har</w:t>
+            </w:r>
+          </w:p>
+        </w:tc>
+        <w:tc>
+          <w:tcPr>
+            <w:tcW w:w="1283" w:type="dxa"/>
+          </w:tcPr>
+          <w:p>
+            <w:pPr>
+              <w:rPr>
+                <w:rFonts w:ascii="Arial" w:eastAsia="Arial" w:hAnsi="Arial" w:cs="Arial"/>
+                <w:lang w:val="pt"/>
+              </w:rPr>
+            </w:pPr>
+            <w:r>
+              <w:rPr>
+                <w:rFonts w:ascii="Arial" w:eastAsia="Arial" w:hAnsi="Arial" w:cs="Arial"/>
+                <w:lang w:val="pt"/>
+              </w:rPr>
+              <w:t>15</w:t>
+            </w:r>
+          </w:p>
+        </w:tc>
+        <w:tc>
+          <w:tcPr>
+            <w:tcW w:w="1417" w:type="dxa"/>
+          </w:tcPr>
+          <w:p>
+            <w:pPr>
+              <w:rPr>
+                <w:rFonts w:ascii="Arial" w:eastAsia="Arial" w:hAnsi="Arial" w:cs="Arial"/>
+                <w:lang w:val="pt"/>
+              </w:rPr>
+            </w:pPr>
+            <w:r>
+              <w:rPr>
+                <w:rFonts w:ascii="Arial" w:eastAsia="Arial" w:hAnsi="Arial" w:cs="Arial"/>
+                <w:lang w:val="pt"/>
+              </w:rPr>
+              <w:t>Código</w:t>
+            </w:r>
+            <w:r>
+              <w:rPr>
+                <w:rFonts w:ascii="Arial" w:eastAsia="Arial" w:hAnsi="Arial" w:cs="Arial"/>
+                <w:lang w:val="pt"/>
+              </w:rPr>
+              <w:t xml:space="preserve"> do cliente </w:t>
+            </w:r>
+          </w:p>
+        </w:tc>
+        <w:tc>
+          <w:tcPr>
+            <w:tcW w:w="1310" w:type="dxa"/>
+          </w:tcPr>
+          <w:p>
+            <w:pPr>
+              <w:rPr>
+                <w:rFonts w:ascii="Arial" w:eastAsia="Arial" w:hAnsi="Arial" w:cs="Arial"/>
+                <w:lang w:val="pt"/>
+              </w:rPr>
+            </w:pPr>
+            <w:r>
+              <w:rPr>
+                <w:rFonts w:ascii="Arial" w:eastAsia="Arial" w:hAnsi="Arial" w:cs="Arial"/>
+                <w:lang w:val="pt"/>
+              </w:rPr>
+              <w:t>Chave Primaria</w:t>
+            </w:r>
+          </w:p>
+        </w:tc>
+      </w:tr>
+      <w:tr>
+        <w:tc>
+          <w:tcPr>
+            <w:tcW w:w="2645" w:type="dxa"/>
+          </w:tcPr>
+          <w:p>
+            <w:pPr>
+              <w:rPr>
+                <w:rFonts w:ascii="Arial" w:eastAsia="Arial" w:hAnsi="Arial" w:cs="Arial"/>
+                <w:lang w:val="pt"/>
+              </w:rPr>
+            </w:pPr>
+            <w:r>
+              <w:rPr>
+                <w:rFonts w:ascii="Arial" w:eastAsia="Arial" w:hAnsi="Arial" w:cs="Arial"/>
+                <w:lang w:val="pt"/>
+              </w:rPr>
+              <w:t>Tipo de Cliente</w:t>
+            </w:r>
+          </w:p>
+        </w:tc>
+        <w:tc>
+          <w:tcPr>
+            <w:tcW w:w="2645" w:type="dxa"/>
+          </w:tcPr>
+          <w:p>
+            <w:pPr>
+              <w:rPr>
+                <w:rFonts w:ascii="Arial" w:eastAsia="Arial" w:hAnsi="Arial" w:cs="Arial"/>
+                <w:lang w:val="pt"/>
+              </w:rPr>
+            </w:pPr>
+            <w:proofErr w:type="spellStart"/>
+            <w:r>
+              <w:rPr>
+                <w:rFonts w:ascii="Arial" w:eastAsia="Arial" w:hAnsi="Arial" w:cs="Arial"/>
+                <w:lang w:val="pt"/>
+              </w:rPr>
+              <w:t>Tipo</w:t>
+            </w:r>
+            <w:r>
+              <w:rPr>
+                <w:rFonts w:ascii="Arial" w:eastAsia="Arial" w:hAnsi="Arial" w:cs="Arial"/>
+                <w:lang w:val="pt"/>
+              </w:rPr>
+              <w:t>_</w:t>
+            </w:r>
+            <w:r>
+              <w:rPr>
+                <w:rFonts w:ascii="Arial" w:eastAsia="Arial" w:hAnsi="Arial" w:cs="Arial"/>
+                <w:lang w:val="pt"/>
+              </w:rPr>
+              <w:t>cliente</w:t>
+            </w:r>
+            <w:proofErr w:type="spellEnd"/>
+          </w:p>
+        </w:tc>
+        <w:tc>
+          <w:tcPr>
+            <w:tcW w:w="1057" w:type="dxa"/>
+          </w:tcPr>
+          <w:p>
+            <w:pPr>
+              <w:rPr>
+                <w:rFonts w:ascii="Arial" w:eastAsia="Arial" w:hAnsi="Arial" w:cs="Arial"/>
+                <w:lang w:val="pt"/>
+              </w:rPr>
+            </w:pPr>
+            <w:proofErr w:type="spellStart"/>
+            <w:r>
+              <w:rPr>
+                <w:rFonts w:ascii="Arial" w:eastAsia="Arial" w:hAnsi="Arial" w:cs="Arial"/>
+                <w:lang w:val="pt"/>
+              </w:rPr>
+              <w:t>Varchar</w:t>
+            </w:r>
+            <w:proofErr w:type="spellEnd"/>
+          </w:p>
+        </w:tc>
+        <w:tc>
+          <w:tcPr>
+            <w:tcW w:w="1283" w:type="dxa"/>
+          </w:tcPr>
+          <w:p>
+            <w:pPr>
+              <w:rPr>
+                <w:rFonts w:ascii="Arial" w:eastAsia="Arial" w:hAnsi="Arial" w:cs="Arial"/>
+                <w:lang w:val="pt"/>
+              </w:rPr>
+            </w:pPr>
+            <w:r>
+              <w:rPr>
+                <w:rFonts w:ascii="Arial" w:eastAsia="Arial" w:hAnsi="Arial" w:cs="Arial"/>
+                <w:lang w:val="pt"/>
+              </w:rPr>
+              <w:t>1</w:t>
+            </w:r>
+          </w:p>
+        </w:tc>
+        <w:tc>
+          <w:tcPr>
+            <w:tcW w:w="1417" w:type="dxa"/>
+          </w:tcPr>
+          <w:p>
+            <w:pPr>
+              <w:rPr>
+                <w:rFonts w:ascii="Arial" w:eastAsia="Arial" w:hAnsi="Arial" w:cs="Arial"/>
+                <w:lang w:val="pt"/>
+              </w:rPr>
+            </w:pPr>
+            <w:r>
+              <w:rPr>
+                <w:rFonts w:ascii="Arial" w:eastAsia="Arial" w:hAnsi="Arial" w:cs="Arial"/>
+                <w:lang w:val="pt"/>
+              </w:rPr>
+              <w:t>Pessoa Física</w:t>
+            </w:r>
+            <w:r>
+              <w:rPr>
+                <w:rFonts w:ascii="Arial" w:eastAsia="Arial" w:hAnsi="Arial" w:cs="Arial"/>
+                <w:lang w:val="pt"/>
+              </w:rPr>
+              <w:t xml:space="preserve"> ou jurídico</w:t>
+            </w:r>
+          </w:p>
+        </w:tc>
+        <w:tc>
+          <w:tcPr>
+            <w:tcW w:w="1310" w:type="dxa"/>
+          </w:tcPr>
+          <w:p>
+            <w:pPr>
+              <w:rPr>
+                <w:rFonts w:ascii="Arial" w:eastAsia="Arial" w:hAnsi="Arial" w:cs="Arial"/>
+                <w:lang w:val="pt"/>
+              </w:rPr>
+            </w:pPr>
+            <w:r>
+              <w:rPr>
+                <w:rFonts w:ascii="Arial" w:eastAsia="Arial" w:hAnsi="Arial" w:cs="Arial"/>
+                <w:lang w:val="pt"/>
+              </w:rPr>
+              <w:t>Não Nulo</w:t>
+            </w:r>
+          </w:p>
+        </w:tc>
+      </w:tr>
+      <w:tr>
+        <w:tc>
+          <w:tcPr>
+            <w:tcW w:w="2645" w:type="dxa"/>
+          </w:tcPr>
+          <w:p>
+            <w:pPr>
+              <w:rPr>
+                <w:rFonts w:ascii="Arial" w:eastAsia="Arial" w:hAnsi="Arial" w:cs="Arial"/>
+                <w:lang w:val="pt"/>
+              </w:rPr>
+            </w:pPr>
+            <w:proofErr w:type="spellStart"/>
+            <w:r>
+              <w:rPr>
+                <w:rFonts w:ascii="Arial" w:eastAsia="Arial" w:hAnsi="Arial" w:cs="Arial"/>
+                <w:lang w:val="pt"/>
+              </w:rPr>
+              <w:t>Forma</w:t>
+            </w:r>
+            <w:r>
+              <w:rPr>
+                <w:rFonts w:ascii="Arial" w:eastAsia="Arial" w:hAnsi="Arial" w:cs="Arial"/>
+                <w:lang w:val="pt"/>
+              </w:rPr>
+              <w:t>_</w:t>
+            </w:r>
+            <w:r>
+              <w:rPr>
+                <w:rFonts w:ascii="Arial" w:eastAsia="Arial" w:hAnsi="Arial" w:cs="Arial"/>
+                <w:lang w:val="pt"/>
+              </w:rPr>
+              <w:t>de</w:t>
+            </w:r>
+            <w:r>
+              <w:rPr>
+                <w:rFonts w:ascii="Arial" w:eastAsia="Arial" w:hAnsi="Arial" w:cs="Arial"/>
+                <w:lang w:val="pt"/>
+              </w:rPr>
+              <w:t>_</w:t>
+            </w:r>
+            <w:r>
+              <w:rPr>
+                <w:rFonts w:ascii="Arial" w:eastAsia="Arial" w:hAnsi="Arial" w:cs="Arial"/>
+                <w:lang w:val="pt"/>
+              </w:rPr>
+              <w:t>pagamento</w:t>
+            </w:r>
+            <w:proofErr w:type="spellEnd"/>
+          </w:p>
+        </w:tc>
+        <w:tc>
+          <w:tcPr>
+            <w:tcW w:w="2645" w:type="dxa"/>
+          </w:tcPr>
+          <w:p>
+            <w:pPr>
+              <w:rPr>
+                <w:rFonts w:ascii="Arial" w:eastAsia="Arial" w:hAnsi="Arial" w:cs="Arial"/>
+                <w:lang w:val="pt"/>
+              </w:rPr>
+            </w:pPr>
+            <w:proofErr w:type="spellStart"/>
+            <w:r>
+              <w:rPr>
+                <w:rFonts w:ascii="Arial" w:eastAsia="Arial" w:hAnsi="Arial" w:cs="Arial"/>
+                <w:lang w:val="pt"/>
+              </w:rPr>
+              <w:t>Forma</w:t>
+            </w:r>
+            <w:r>
+              <w:rPr>
+                <w:rFonts w:ascii="Arial" w:eastAsia="Arial" w:hAnsi="Arial" w:cs="Arial"/>
+                <w:lang w:val="pt"/>
+              </w:rPr>
+              <w:t>_</w:t>
+            </w:r>
+            <w:r>
+              <w:rPr>
+                <w:rFonts w:ascii="Arial" w:eastAsia="Arial" w:hAnsi="Arial" w:cs="Arial"/>
+                <w:lang w:val="pt"/>
+              </w:rPr>
+              <w:t>de</w:t>
+            </w:r>
+            <w:r>
+              <w:rPr>
+                <w:rFonts w:ascii="Arial" w:eastAsia="Arial" w:hAnsi="Arial" w:cs="Arial"/>
+                <w:lang w:val="pt"/>
+              </w:rPr>
+              <w:t>_</w:t>
+            </w:r>
+            <w:r>
+              <w:rPr>
+                <w:rFonts w:ascii="Arial" w:eastAsia="Arial" w:hAnsi="Arial" w:cs="Arial"/>
+                <w:lang w:val="pt"/>
+              </w:rPr>
+              <w:t>pagamento</w:t>
+            </w:r>
+            <w:proofErr w:type="spellEnd"/>
+          </w:p>
+        </w:tc>
+        <w:tc>
+          <w:tcPr>
+            <w:tcW w:w="1057" w:type="dxa"/>
+          </w:tcPr>
+          <w:p>
+            <w:pPr>
+              <w:rPr>
+                <w:rFonts w:ascii="Arial" w:eastAsia="Arial" w:hAnsi="Arial" w:cs="Arial"/>
+                <w:lang w:val="pt"/>
+              </w:rPr>
+            </w:pPr>
+            <w:proofErr w:type="spellStart"/>
+            <w:r>
+              <w:rPr>
+                <w:rFonts w:ascii="Arial" w:eastAsia="Arial" w:hAnsi="Arial" w:cs="Arial"/>
+                <w:lang w:val="pt"/>
+              </w:rPr>
+              <w:t>Varchar</w:t>
+            </w:r>
+            <w:proofErr w:type="spellEnd"/>
+          </w:p>
+        </w:tc>
+        <w:tc>
+          <w:tcPr>
+            <w:tcW w:w="1283" w:type="dxa"/>
+          </w:tcPr>
+          <w:p>
+            <w:pPr>
+              <w:rPr>
+                <w:rFonts w:ascii="Arial" w:eastAsia="Arial" w:hAnsi="Arial" w:cs="Arial"/>
+                <w:lang w:val="pt"/>
+              </w:rPr>
+            </w:pPr>
+            <w:r>
+              <w:rPr>
+                <w:rFonts w:ascii="Arial" w:eastAsia="Arial" w:hAnsi="Arial" w:cs="Arial"/>
+                <w:lang w:val="pt"/>
+              </w:rPr>
+              <w:t>3</w:t>
+            </w:r>
+            <w:r>
+              <w:rPr>
+                <w:rFonts w:ascii="Arial" w:eastAsia="Arial" w:hAnsi="Arial" w:cs="Arial"/>
+                <w:lang w:val="pt"/>
+              </w:rPr>
+              <w:t>0</w:t>
+            </w:r>
+          </w:p>
+        </w:tc>
+        <w:tc>
+          <w:tcPr>
+            <w:tcW w:w="1417" w:type="dxa"/>
+          </w:tcPr>
+          <w:p>
+            <w:pPr>
+              <w:rPr>
+                <w:rFonts w:ascii="Arial" w:eastAsia="Arial" w:hAnsi="Arial" w:cs="Arial"/>
+                <w:lang w:val="pt"/>
+              </w:rPr>
+            </w:pPr>
+            <w:r>
+              <w:rPr>
+                <w:rFonts w:ascii="Arial" w:eastAsia="Arial" w:hAnsi="Arial" w:cs="Arial"/>
+                <w:lang w:val="pt"/>
+              </w:rPr>
+              <w:t>Meio de pagamento</w:t>
+            </w:r>
+          </w:p>
+        </w:tc>
+        <w:tc>
+          <w:tcPr>
+            <w:tcW w:w="1310" w:type="dxa"/>
+          </w:tcPr>
+          <w:p>
+            <w:pPr>
+              <w:rPr>
+                <w:rFonts w:ascii="Arial" w:eastAsia="Arial" w:hAnsi="Arial" w:cs="Arial"/>
+                <w:lang w:val="pt"/>
+              </w:rPr>
+            </w:pPr>
+          </w:p>
+        </w:tc>
+      </w:tr>
+      <w:tr>
+        <w:tc>
+          <w:tcPr>
+            <w:tcW w:w="2645" w:type="dxa"/>
+          </w:tcPr>
+          <w:p>
+            <w:pPr>
+              <w:rPr>
+                <w:rFonts w:ascii="Arial" w:eastAsia="Arial" w:hAnsi="Arial" w:cs="Arial"/>
+                <w:lang w:val="pt"/>
+              </w:rPr>
+            </w:pPr>
+            <w:proofErr w:type="spellStart"/>
+            <w:r>
+              <w:rPr>
+                <w:rFonts w:ascii="Arial" w:eastAsia="Arial" w:hAnsi="Arial" w:cs="Arial"/>
+                <w:lang w:val="pt"/>
+              </w:rPr>
+              <w:t>Valor_medio_de_ordem</w:t>
+            </w:r>
+            <w:proofErr w:type="spellEnd"/>
+          </w:p>
+        </w:tc>
+        <w:tc>
+          <w:tcPr>
+            <w:tcW w:w="2645" w:type="dxa"/>
+          </w:tcPr>
+          <w:p>
+            <w:pPr>
+              <w:rPr>
+                <w:rFonts w:ascii="Arial" w:eastAsia="Arial" w:hAnsi="Arial" w:cs="Arial"/>
+                <w:lang w:val="pt"/>
+              </w:rPr>
+            </w:pPr>
+            <w:r>
+              <w:rPr>
+                <w:rFonts w:ascii="Arial" w:eastAsia="Arial" w:hAnsi="Arial" w:cs="Arial"/>
+                <w:lang w:val="pt"/>
+              </w:rPr>
+              <w:t>AOV</w:t>
+            </w:r>
+          </w:p>
+        </w:tc>
+        <w:tc>
+          <w:tcPr>
+            <w:tcW w:w="1057" w:type="dxa"/>
+          </w:tcPr>
+          <w:p>
+            <w:pPr>
+              <w:rPr>
+                <w:rFonts w:ascii="Arial" w:eastAsia="Arial" w:hAnsi="Arial" w:cs="Arial"/>
+                <w:lang w:val="pt"/>
+              </w:rPr>
+            </w:pPr>
+            <w:r>
+              <w:rPr>
+                <w:rFonts w:ascii="Arial" w:eastAsia="Arial" w:hAnsi="Arial" w:cs="Arial"/>
+                <w:lang w:val="pt"/>
+              </w:rPr>
+              <w:t>Decimal</w:t>
+            </w:r>
+          </w:p>
+        </w:tc>
+        <w:tc>
+          <w:tcPr>
+            <w:tcW w:w="1283" w:type="dxa"/>
+          </w:tcPr>
+          <w:p>
+            <w:pPr>
+              <w:rPr>
+                <w:rFonts w:ascii="Arial" w:eastAsia="Arial" w:hAnsi="Arial" w:cs="Arial"/>
+                <w:lang w:val="pt"/>
+              </w:rPr>
+            </w:pPr>
+            <w:r>
+              <w:rPr>
+                <w:rFonts w:ascii="Arial" w:eastAsia="Arial" w:hAnsi="Arial" w:cs="Arial"/>
+                <w:lang w:val="pt"/>
+              </w:rPr>
+              <w:t>30</w:t>
+            </w:r>
+          </w:p>
+        </w:tc>
+        <w:tc>
+          <w:tcPr>
+            <w:tcW w:w="1417" w:type="dxa"/>
+          </w:tcPr>
+          <w:p>
+            <w:pPr>
+              <w:rPr>
+                <w:rFonts w:ascii="Arial" w:eastAsia="Arial" w:hAnsi="Arial" w:cs="Arial"/>
+                <w:lang w:val="pt"/>
+              </w:rPr>
+            </w:pPr>
+          </w:p>
+        </w:tc>
+        <w:tc>
+          <w:tcPr>
+            <w:tcW w:w="1310" w:type="dxa"/>
+          </w:tcPr>
+          <w:p>
+            <w:pPr>
+              <w:rPr>
+                <w:rFonts w:ascii="Arial" w:eastAsia="Arial" w:hAnsi="Arial" w:cs="Arial"/>
+                <w:lang w:val="pt"/>
+              </w:rPr>
+            </w:pPr>
+          </w:p>
+        </w:tc>
+      </w:tr>
+    </w:tbl>
+    <w:p>
+      <w:pPr>
+        <w:rPr>
+          <w:rFonts w:ascii="Arial" w:eastAsia="Arial" w:hAnsi="Arial" w:cs="Arial"/>
+          <w:lang w:val="pt"/>
+        </w:rPr>
+      </w:pPr>
+    </w:p>
+    <w:p>
+      <w:pPr>
+        <w:rPr>
+          <w:rFonts w:ascii="Arial" w:eastAsia="Arial" w:hAnsi="Arial" w:cs="Arial"/>
+          <w:lang w:val="pt"/>
+        </w:rPr>
+      </w:pPr>
+    </w:p>
+    <w:p>
+      <w:pPr>
+        <w:rPr>
+          <w:rFonts w:ascii="Arial" w:eastAsia="Arial" w:hAnsi="Arial" w:cs="Arial"/>
+          <w:lang w:val="pt"/>
+        </w:rPr>
+      </w:pPr>
+      <w:r>
+        <w:rPr>
+          <w:rFonts w:ascii="Arial" w:eastAsia="Arial" w:hAnsi="Arial" w:cs="Arial"/>
+          <w:lang w:val="pt"/>
+        </w:rPr>
+        <w:t>Dicion</w:t>
+      </w:r>
+      <w:r>
+        <w:rPr>
+          <w:rFonts w:ascii="Arial" w:eastAsia="Arial" w:hAnsi="Arial" w:cs="Arial"/>
+          <w:lang w:val="pt"/>
+        </w:rPr>
+        <w:t xml:space="preserve">ário – </w:t>
+      </w:r>
+      <w:proofErr w:type="spellStart"/>
+      <w:r>
+        <w:rPr>
+          <w:rFonts w:ascii="Arial" w:eastAsia="Arial" w:hAnsi="Arial" w:cs="Arial"/>
+          <w:lang w:val="pt"/>
+        </w:rPr>
+        <w:t>Dealer</w:t>
+      </w:r>
+      <w:proofErr w:type="spellEnd"/>
+      <w:r>
+        <w:rPr>
+          <w:rFonts w:ascii="Arial" w:eastAsia="Arial" w:hAnsi="Arial" w:cs="Arial"/>
+          <w:lang w:val="pt"/>
+        </w:rPr>
+        <w:t xml:space="preserve"> Concessionária</w:t>
+      </w:r>
+    </w:p>
+    <w:tbl>
+      <w:tblPr>
+        <w:tblStyle w:val="Tabelacomgrade"/>
+        <w:tblW w:w="0" w:type="auto"/>
+        <w:tblLook w:val="04A0" w:firstRow="1" w:lastRow="0" w:firstColumn="1" w:lastColumn="0" w:noHBand="0" w:noVBand="1"/>
+      </w:tblPr>
+      <w:tblGrid>
+        <w:gridCol w:w="1415"/>
+        <w:gridCol w:w="1415"/>
+        <w:gridCol w:w="1416"/>
+        <w:gridCol w:w="1416"/>
+        <w:gridCol w:w="1416"/>
+        <w:gridCol w:w="1416"/>
+      </w:tblGrid>
+      <w:tr>
+        <w:tc>
+          <w:tcPr>
+            <w:tcW w:w="1415" w:type="dxa"/>
+          </w:tcPr>
+          <w:p>
+            <w:pPr>
+              <w:rPr>
+                <w:rFonts w:ascii="Arial" w:eastAsia="Arial" w:hAnsi="Arial" w:cs="Arial"/>
+                <w:lang w:val="pt"/>
+              </w:rPr>
+            </w:pPr>
+            <w:r>
+              <w:rPr>
+                <w:rFonts w:ascii="Arial" w:eastAsia="Arial" w:hAnsi="Arial" w:cs="Arial"/>
+                <w:lang w:val="pt"/>
+              </w:rPr>
+              <w:t>Atributo</w:t>
+            </w:r>
+          </w:p>
+        </w:tc>
+        <w:tc>
+          <w:tcPr>
+            <w:tcW w:w="1415" w:type="dxa"/>
+          </w:tcPr>
+          <w:p>
+            <w:pPr>
+              <w:rPr>
+                <w:rFonts w:ascii="Arial" w:eastAsia="Arial" w:hAnsi="Arial" w:cs="Arial"/>
+                <w:lang w:val="pt"/>
+              </w:rPr>
+            </w:pPr>
+            <w:r>
+              <w:rPr>
+                <w:rFonts w:ascii="Arial" w:eastAsia="Arial" w:hAnsi="Arial" w:cs="Arial"/>
+                <w:lang w:val="pt"/>
+              </w:rPr>
+              <w:t>Camp</w:t>
+            </w:r>
+            <w:r>
+              <w:rPr>
+                <w:rFonts w:ascii="Arial" w:eastAsia="Arial" w:hAnsi="Arial" w:cs="Arial"/>
+                <w:lang w:val="pt"/>
+              </w:rPr>
+              <w:t>o</w:t>
+            </w:r>
+          </w:p>
+        </w:tc>
+        <w:tc>
+          <w:tcPr>
+            <w:tcW w:w="1416" w:type="dxa"/>
+          </w:tcPr>
+          <w:p>
+            <w:pPr>
+              <w:rPr>
+                <w:rFonts w:ascii="Arial" w:eastAsia="Arial" w:hAnsi="Arial" w:cs="Arial"/>
+                <w:lang w:val="pt"/>
+              </w:rPr>
+            </w:pPr>
+            <w:r>
+              <w:rPr>
+                <w:rFonts w:ascii="Arial" w:eastAsia="Arial" w:hAnsi="Arial" w:cs="Arial"/>
+                <w:lang w:val="pt"/>
+              </w:rPr>
+              <w:t>Tipo de dados</w:t>
+            </w:r>
+          </w:p>
+        </w:tc>
+        <w:tc>
+          <w:tcPr>
+            <w:tcW w:w="1416" w:type="dxa"/>
+          </w:tcPr>
+          <w:p>
+            <w:pPr>
+              <w:rPr>
+                <w:rFonts w:ascii="Arial" w:eastAsia="Arial" w:hAnsi="Arial" w:cs="Arial"/>
+                <w:lang w:val="pt"/>
+              </w:rPr>
+            </w:pPr>
+            <w:r>
+              <w:rPr>
+                <w:rFonts w:ascii="Arial" w:eastAsia="Arial" w:hAnsi="Arial" w:cs="Arial"/>
+                <w:lang w:val="pt"/>
+              </w:rPr>
+              <w:t>Tamanho</w:t>
+            </w:r>
+          </w:p>
+        </w:tc>
+        <w:tc>
+          <w:tcPr>
+            <w:tcW w:w="1416" w:type="dxa"/>
+          </w:tcPr>
+          <w:p>
+            <w:pPr>
+              <w:rPr>
+                <w:rFonts w:ascii="Arial" w:eastAsia="Arial" w:hAnsi="Arial" w:cs="Arial"/>
+                <w:lang w:val="pt"/>
+              </w:rPr>
+            </w:pPr>
+            <w:r>
+              <w:rPr>
+                <w:rFonts w:ascii="Arial" w:eastAsia="Arial" w:hAnsi="Arial" w:cs="Arial"/>
+                <w:lang w:val="pt"/>
+              </w:rPr>
+              <w:t>Descrição</w:t>
+            </w:r>
+          </w:p>
+        </w:tc>
+        <w:tc>
+          <w:tcPr>
+            <w:tcW w:w="1416" w:type="dxa"/>
+          </w:tcPr>
+          <w:p>
+            <w:pPr>
+              <w:rPr>
+                <w:rFonts w:ascii="Arial" w:eastAsia="Arial" w:hAnsi="Arial" w:cs="Arial"/>
+                <w:lang w:val="pt"/>
+              </w:rPr>
+            </w:pPr>
+            <w:r>
+              <w:rPr>
+                <w:rFonts w:ascii="Arial" w:eastAsia="Arial" w:hAnsi="Arial" w:cs="Arial"/>
+                <w:lang w:val="pt"/>
+              </w:rPr>
+              <w:t>Restrição</w:t>
+            </w:r>
+          </w:p>
+        </w:tc>
+      </w:tr>
+      <w:tr>
+        <w:tc>
+          <w:tcPr>
+            <w:tcW w:w="1415" w:type="dxa"/>
+          </w:tcPr>
+          <w:p>
+            <w:pPr>
+              <w:rPr>
+                <w:rFonts w:ascii="Arial" w:eastAsia="Arial" w:hAnsi="Arial" w:cs="Arial"/>
+                <w:lang w:val="pt"/>
+              </w:rPr>
+            </w:pPr>
+          </w:p>
+        </w:tc>
+        <w:tc>
+          <w:tcPr>
+            <w:tcW w:w="1415" w:type="dxa"/>
+          </w:tcPr>
+          <w:p>
+            <w:pPr>
+              <w:rPr>
+                <w:rFonts w:ascii="Arial" w:eastAsia="Arial" w:hAnsi="Arial" w:cs="Arial"/>
+                <w:lang w:val="pt"/>
+              </w:rPr>
+            </w:pPr>
+          </w:p>
+        </w:tc>
+        <w:tc>
+          <w:tcPr>
+            <w:tcW w:w="1416" w:type="dxa"/>
+          </w:tcPr>
+          <w:p>
+            <w:pPr>
+              <w:rPr>
+                <w:rFonts w:ascii="Arial" w:eastAsia="Arial" w:hAnsi="Arial" w:cs="Arial"/>
+                <w:lang w:val="pt"/>
+              </w:rPr>
+            </w:pPr>
+          </w:p>
+        </w:tc>
+        <w:tc>
+          <w:tcPr>
+            <w:tcW w:w="1416" w:type="dxa"/>
+          </w:tcPr>
+          <w:p>
+            <w:pPr>
+              <w:rPr>
+                <w:rFonts w:ascii="Arial" w:eastAsia="Arial" w:hAnsi="Arial" w:cs="Arial"/>
+                <w:lang w:val="pt"/>
+              </w:rPr>
+            </w:pPr>
+          </w:p>
+        </w:tc>
+        <w:tc>
+          <w:tcPr>
+            <w:tcW w:w="1416" w:type="dxa"/>
+          </w:tcPr>
+          <w:p>
+            <w:pPr>
+              <w:rPr>
+                <w:rFonts w:ascii="Arial" w:eastAsia="Arial" w:hAnsi="Arial" w:cs="Arial"/>
+                <w:lang w:val="pt"/>
+              </w:rPr>
+            </w:pPr>
+          </w:p>
+        </w:tc>
+        <w:tc>
+          <w:tcPr>
+            <w:tcW w:w="1416" w:type="dxa"/>
+          </w:tcPr>
+          <w:p>
+            <w:pPr>
+              <w:rPr>
+                <w:rFonts w:ascii="Arial" w:eastAsia="Arial" w:hAnsi="Arial" w:cs="Arial"/>
+                <w:lang w:val="pt"/>
+              </w:rPr>
+            </w:pPr>
+          </w:p>
+        </w:tc>
+      </w:tr>
+      <w:tr>
+        <w:tc>
+          <w:tcPr>
+            <w:tcW w:w="1415" w:type="dxa"/>
+          </w:tcPr>
+          <w:p>
+            <w:pPr>
+              <w:rPr>
+                <w:rFonts w:ascii="Arial" w:eastAsia="Arial" w:hAnsi="Arial" w:cs="Arial"/>
+                <w:lang w:val="pt"/>
+              </w:rPr>
+            </w:pPr>
+          </w:p>
+        </w:tc>
+        <w:tc>
+          <w:tcPr>
+            <w:tcW w:w="1415" w:type="dxa"/>
+          </w:tcPr>
+          <w:p>
+            <w:pPr>
+              <w:rPr>
+                <w:rFonts w:ascii="Arial" w:eastAsia="Arial" w:hAnsi="Arial" w:cs="Arial"/>
+                <w:lang w:val="pt"/>
+              </w:rPr>
+            </w:pPr>
+          </w:p>
+        </w:tc>
+        <w:tc>
+          <w:tcPr>
+            <w:tcW w:w="1416" w:type="dxa"/>
+          </w:tcPr>
+          <w:p>
+            <w:pPr>
+              <w:rPr>
+                <w:rFonts w:ascii="Arial" w:eastAsia="Arial" w:hAnsi="Arial" w:cs="Arial"/>
+                <w:lang w:val="pt"/>
+              </w:rPr>
+            </w:pPr>
+          </w:p>
+        </w:tc>
+        <w:tc>
+          <w:tcPr>
+            <w:tcW w:w="1416" w:type="dxa"/>
+          </w:tcPr>
+          <w:p>
+            <w:pPr>
+              <w:rPr>
+                <w:rFonts w:ascii="Arial" w:eastAsia="Arial" w:hAnsi="Arial" w:cs="Arial"/>
+                <w:lang w:val="pt"/>
+              </w:rPr>
+            </w:pPr>
+          </w:p>
+        </w:tc>
+        <w:tc>
+          <w:tcPr>
+            <w:tcW w:w="1416" w:type="dxa"/>
+          </w:tcPr>
+          <w:p>
+            <w:pPr>
+              <w:rPr>
+                <w:rFonts w:ascii="Arial" w:eastAsia="Arial" w:hAnsi="Arial" w:cs="Arial"/>
+                <w:lang w:val="pt"/>
+              </w:rPr>
+            </w:pPr>
+          </w:p>
+        </w:tc>
+        <w:tc>
+          <w:tcPr>
+            <w:tcW w:w="1416" w:type="dxa"/>
+          </w:tcPr>
+          <w:p>
+            <w:pPr>
+              <w:rPr>
+                <w:rFonts w:ascii="Arial" w:eastAsia="Arial" w:hAnsi="Arial" w:cs="Arial"/>
+                <w:lang w:val="pt"/>
+              </w:rPr>
+            </w:pPr>
+          </w:p>
+        </w:tc>
+      </w:tr>
+      <w:tr>
+        <w:tc>
+          <w:tcPr>
+            <w:tcW w:w="1415" w:type="dxa"/>
+          </w:tcPr>
+          <w:p>
+            <w:pPr>
+              <w:rPr>
+                <w:rFonts w:ascii="Arial" w:eastAsia="Arial" w:hAnsi="Arial" w:cs="Arial"/>
+                <w:lang w:val="pt"/>
+              </w:rPr>
+            </w:pPr>
+          </w:p>
+        </w:tc>
+        <w:tc>
+          <w:tcPr>
+            <w:tcW w:w="1415" w:type="dxa"/>
+          </w:tcPr>
+          <w:p>
+            <w:pPr>
+              <w:rPr>
+                <w:rFonts w:ascii="Arial" w:eastAsia="Arial" w:hAnsi="Arial" w:cs="Arial"/>
+                <w:lang w:val="pt"/>
+              </w:rPr>
+            </w:pPr>
+          </w:p>
+        </w:tc>
+        <w:tc>
+          <w:tcPr>
+            <w:tcW w:w="1416" w:type="dxa"/>
+          </w:tcPr>
+          <w:p>
+            <w:pPr>
+              <w:rPr>
+                <w:rFonts w:ascii="Arial" w:eastAsia="Arial" w:hAnsi="Arial" w:cs="Arial"/>
+                <w:lang w:val="pt"/>
+              </w:rPr>
+            </w:pPr>
+          </w:p>
+        </w:tc>
+        <w:tc>
+          <w:tcPr>
+            <w:tcW w:w="1416" w:type="dxa"/>
+          </w:tcPr>
+          <w:p>
+            <w:pPr>
+              <w:rPr>
+                <w:rFonts w:ascii="Arial" w:eastAsia="Arial" w:hAnsi="Arial" w:cs="Arial"/>
+                <w:lang w:val="pt"/>
+              </w:rPr>
+            </w:pPr>
+          </w:p>
+        </w:tc>
+        <w:tc>
+          <w:tcPr>
+            <w:tcW w:w="1416" w:type="dxa"/>
+          </w:tcPr>
+          <w:p>
+            <w:pPr>
+              <w:rPr>
+                <w:rFonts w:ascii="Arial" w:eastAsia="Arial" w:hAnsi="Arial" w:cs="Arial"/>
+                <w:lang w:val="pt"/>
+              </w:rPr>
+            </w:pPr>
+          </w:p>
+        </w:tc>
+        <w:tc>
+          <w:tcPr>
+            <w:tcW w:w="1416" w:type="dxa"/>
+          </w:tcPr>
+          <w:p>
+            <w:pPr>
+              <w:rPr>
+                <w:rFonts w:ascii="Arial" w:eastAsia="Arial" w:hAnsi="Arial" w:cs="Arial"/>
+                <w:lang w:val="pt"/>
+              </w:rPr>
+            </w:pPr>
+          </w:p>
+        </w:tc>
+      </w:tr>
+      <w:tr>
+        <w:tc>
+          <w:tcPr>
+            <w:tcW w:w="1415" w:type="dxa"/>
+          </w:tcPr>
+          <w:p>
+            <w:pPr>
+              <w:rPr>
+                <w:rFonts w:ascii="Arial" w:eastAsia="Arial" w:hAnsi="Arial" w:cs="Arial"/>
+                <w:lang w:val="pt"/>
+              </w:rPr>
+            </w:pPr>
+          </w:p>
+        </w:tc>
+        <w:tc>
+          <w:tcPr>
+            <w:tcW w:w="1415" w:type="dxa"/>
+          </w:tcPr>
+          <w:p>
+            <w:pPr>
+              <w:rPr>
+                <w:rFonts w:ascii="Arial" w:eastAsia="Arial" w:hAnsi="Arial" w:cs="Arial"/>
+                <w:lang w:val="pt"/>
+              </w:rPr>
+            </w:pPr>
+          </w:p>
+        </w:tc>
+        <w:tc>
+          <w:tcPr>
+            <w:tcW w:w="1416" w:type="dxa"/>
+          </w:tcPr>
+          <w:p>
+            <w:pPr>
+              <w:rPr>
+                <w:rFonts w:ascii="Arial" w:eastAsia="Arial" w:hAnsi="Arial" w:cs="Arial"/>
+                <w:lang w:val="pt"/>
+              </w:rPr>
+            </w:pPr>
+          </w:p>
+        </w:tc>
+        <w:tc>
+          <w:tcPr>
+            <w:tcW w:w="1416" w:type="dxa"/>
+          </w:tcPr>
+          <w:p>
+            <w:pPr>
+              <w:rPr>
+                <w:rFonts w:ascii="Arial" w:eastAsia="Arial" w:hAnsi="Arial" w:cs="Arial"/>
+                <w:lang w:val="pt"/>
+              </w:rPr>
+            </w:pPr>
+          </w:p>
+        </w:tc>
+        <w:tc>
+          <w:tcPr>
+            <w:tcW w:w="1416" w:type="dxa"/>
+          </w:tcPr>
+          <w:p>
+            <w:pPr>
+              <w:rPr>
+                <w:rFonts w:ascii="Arial" w:eastAsia="Arial" w:hAnsi="Arial" w:cs="Arial"/>
+                <w:lang w:val="pt"/>
+              </w:rPr>
+            </w:pPr>
+          </w:p>
+        </w:tc>
+        <w:tc>
+          <w:tcPr>
+            <w:tcW w:w="1416" w:type="dxa"/>
+          </w:tcPr>
+          <w:p>
+            <w:pPr>
+              <w:rPr>
+                <w:rFonts w:ascii="Arial" w:eastAsia="Arial" w:hAnsi="Arial" w:cs="Arial"/>
+                <w:lang w:val="pt"/>
+              </w:rPr>
+            </w:pPr>
+          </w:p>
+        </w:tc>
+      </w:tr>
+      <w:tr>
+        <w:tc>
+          <w:tcPr>
+            <w:tcW w:w="1415" w:type="dxa"/>
+          </w:tcPr>
+          <w:p>
+            <w:pPr>
+              <w:rPr>
+                <w:rFonts w:ascii="Arial" w:eastAsia="Arial" w:hAnsi="Arial" w:cs="Arial"/>
+                <w:lang w:val="pt"/>
+              </w:rPr>
+            </w:pPr>
+          </w:p>
+        </w:tc>
+        <w:tc>
+          <w:tcPr>
+            <w:tcW w:w="1415" w:type="dxa"/>
+          </w:tcPr>
+          <w:p>
+            <w:pPr>
+              <w:rPr>
+                <w:rFonts w:ascii="Arial" w:eastAsia="Arial" w:hAnsi="Arial" w:cs="Arial"/>
+                <w:lang w:val="pt"/>
+              </w:rPr>
+            </w:pPr>
+          </w:p>
+        </w:tc>
+        <w:tc>
+          <w:tcPr>
+            <w:tcW w:w="1416" w:type="dxa"/>
+          </w:tcPr>
+          <w:p>
+            <w:pPr>
+              <w:rPr>
+                <w:rFonts w:ascii="Arial" w:eastAsia="Arial" w:hAnsi="Arial" w:cs="Arial"/>
+                <w:lang w:val="pt"/>
+              </w:rPr>
+            </w:pPr>
+          </w:p>
+        </w:tc>
+        <w:tc>
+          <w:tcPr>
+            <w:tcW w:w="1416" w:type="dxa"/>
+          </w:tcPr>
+          <w:p>
+            <w:pPr>
+              <w:rPr>
+                <w:rFonts w:ascii="Arial" w:eastAsia="Arial" w:hAnsi="Arial" w:cs="Arial"/>
+                <w:lang w:val="pt"/>
+              </w:rPr>
+            </w:pPr>
+          </w:p>
+        </w:tc>
+        <w:tc>
+          <w:tcPr>
+            <w:tcW w:w="1416" w:type="dxa"/>
+          </w:tcPr>
+          <w:p>
+            <w:pPr>
+              <w:rPr>
+                <w:rFonts w:ascii="Arial" w:eastAsia="Arial" w:hAnsi="Arial" w:cs="Arial"/>
+                <w:lang w:val="pt"/>
+              </w:rPr>
+            </w:pPr>
+          </w:p>
+        </w:tc>
+        <w:tc>
+          <w:tcPr>
+            <w:tcW w:w="1416" w:type="dxa"/>
+          </w:tcPr>
+          <w:p>
+            <w:pPr>
+              <w:rPr>
+                <w:rFonts w:ascii="Arial" w:eastAsia="Arial" w:hAnsi="Arial" w:cs="Arial"/>
+                <w:lang w:val="pt"/>
+              </w:rPr>
+            </w:pPr>
+          </w:p>
+        </w:tc>
+      </w:tr>
+    </w:tbl>
+    <w:p>
+      <w:pPr>
+        <w:rPr>
+          <w:rFonts w:ascii="Arial" w:eastAsia="Arial" w:hAnsi="Arial" w:cs="Arial"/>
+          <w:lang w:val="pt"/>
+        </w:rPr>
+      </w:pPr>
+    </w:p>
+    <w:p>
+      <w:pPr>
+        <w:rPr>
+          <w:rFonts w:ascii="Arial" w:eastAsia="Arial" w:hAnsi="Arial" w:cs="Arial"/>
+          <w:lang w:val="pt"/>
+        </w:rPr>
+      </w:pPr>
+    </w:p>
+    <w:p>
+      <w:pPr>
+        <w:rPr>
+          <w:rFonts w:ascii="Arial" w:eastAsia="Arial" w:hAnsi="Arial" w:cs="Arial"/>
+          <w:lang w:val="pt"/>
+        </w:rPr>
+      </w:pPr>
+      <w:r>
+        <w:rPr>
+          <w:rFonts w:ascii="Arial" w:eastAsia="Arial" w:hAnsi="Arial" w:cs="Arial"/>
+          <w:lang w:val="pt"/>
+        </w:rPr>
+        <w:t xml:space="preserve">Dicionário </w:t>
+      </w:r>
+      <w:r>
+        <w:rPr>
+          <w:rFonts w:ascii="Arial" w:eastAsia="Arial" w:hAnsi="Arial" w:cs="Arial"/>
+          <w:lang w:val="pt"/>
+        </w:rPr>
+        <w:t>–</w:t>
+      </w:r>
+      <w:r>
+        <w:rPr>
+          <w:rFonts w:ascii="Arial" w:eastAsia="Arial" w:hAnsi="Arial" w:cs="Arial"/>
+          <w:lang w:val="pt"/>
+        </w:rPr>
+        <w:t xml:space="preserve"> </w:t>
+      </w:r>
+      <w:r>
+        <w:rPr>
+          <w:rFonts w:ascii="Arial" w:eastAsia="Arial" w:hAnsi="Arial" w:cs="Arial"/>
+          <w:lang w:val="pt"/>
+        </w:rPr>
+        <w:t>veículo</w:t>
+      </w:r>
+    </w:p>
+    <w:tbl>
+      <w:tblPr>
+        <w:tblStyle w:val="Tabelacomgrade"/>
+        <w:tblW w:w="0" w:type="auto"/>
+        <w:tblLook w:val="04A0" w:firstRow="1" w:lastRow="0" w:firstColumn="1" w:lastColumn="0" w:noHBand="0" w:noVBand="1"/>
+      </w:tblPr>
+      <w:tblGrid>
+        <w:gridCol w:w="1415"/>
+        <w:gridCol w:w="1415"/>
+        <w:gridCol w:w="1416"/>
+        <w:gridCol w:w="1416"/>
+        <w:gridCol w:w="1416"/>
+        <w:gridCol w:w="1416"/>
+      </w:tblGrid>
+      <w:tr>
+        <w:tc>
+          <w:tcPr>
+            <w:tcW w:w="1415" w:type="dxa"/>
+          </w:tcPr>
+          <w:p>
+            <w:pPr>
+              <w:rPr>
+                <w:rFonts w:ascii="Arial" w:eastAsia="Arial" w:hAnsi="Arial" w:cs="Arial"/>
+                <w:lang w:val="pt"/>
+              </w:rPr>
+            </w:pPr>
+            <w:r>
+              <w:rPr>
+                <w:rFonts w:ascii="Arial" w:eastAsia="Arial" w:hAnsi="Arial" w:cs="Arial"/>
+                <w:lang w:val="pt"/>
+              </w:rPr>
+              <w:t>Atributo</w:t>
+            </w:r>
+          </w:p>
+        </w:tc>
+        <w:tc>
+          <w:tcPr>
+            <w:tcW w:w="1415" w:type="dxa"/>
+          </w:tcPr>
+          <w:p>
+            <w:pPr>
+              <w:rPr>
+                <w:rFonts w:ascii="Arial" w:eastAsia="Arial" w:hAnsi="Arial" w:cs="Arial"/>
+                <w:lang w:val="pt"/>
+              </w:rPr>
+            </w:pPr>
+            <w:r>
+              <w:rPr>
+                <w:rFonts w:ascii="Arial" w:eastAsia="Arial" w:hAnsi="Arial" w:cs="Arial"/>
+                <w:lang w:val="pt"/>
+              </w:rPr>
+              <w:t>Campo</w:t>
+            </w:r>
+          </w:p>
+        </w:tc>
+        <w:tc>
+          <w:tcPr>
+            <w:tcW w:w="1416" w:type="dxa"/>
+          </w:tcPr>
+          <w:p>
+            <w:pPr>
+              <w:rPr>
+                <w:rFonts w:ascii="Arial" w:eastAsia="Arial" w:hAnsi="Arial" w:cs="Arial"/>
+                <w:lang w:val="pt"/>
+              </w:rPr>
+            </w:pPr>
+            <w:r>
+              <w:rPr>
+                <w:rFonts w:ascii="Arial" w:eastAsia="Arial" w:hAnsi="Arial" w:cs="Arial"/>
+                <w:lang w:val="pt"/>
+              </w:rPr>
+              <w:t>Tipo</w:t>
+            </w:r>
+            <w:r>
+              <w:rPr>
+                <w:rFonts w:ascii="Arial" w:eastAsia="Arial" w:hAnsi="Arial" w:cs="Arial"/>
+                <w:lang w:val="pt"/>
+              </w:rPr>
+              <w:t xml:space="preserve"> de dados</w:t>
+            </w:r>
+          </w:p>
+        </w:tc>
+        <w:tc>
+          <w:tcPr>
+            <w:tcW w:w="1416" w:type="dxa"/>
+          </w:tcPr>
+          <w:p>
+            <w:pPr>
+              <w:rPr>
+                <w:rFonts w:ascii="Arial" w:eastAsia="Arial" w:hAnsi="Arial" w:cs="Arial"/>
+                <w:lang w:val="pt"/>
+              </w:rPr>
+            </w:pPr>
+            <w:r>
+              <w:rPr>
+                <w:rFonts w:ascii="Arial" w:eastAsia="Arial" w:hAnsi="Arial" w:cs="Arial"/>
+                <w:lang w:val="pt"/>
+              </w:rPr>
+              <w:t>Tamanho</w:t>
+            </w:r>
+          </w:p>
+        </w:tc>
+        <w:tc>
+          <w:tcPr>
+            <w:tcW w:w="1416" w:type="dxa"/>
+          </w:tcPr>
+          <w:p>
+            <w:pPr>
+              <w:rPr>
+                <w:rFonts w:ascii="Arial" w:eastAsia="Arial" w:hAnsi="Arial" w:cs="Arial"/>
+                <w:lang w:val="pt"/>
+              </w:rPr>
+            </w:pPr>
+            <w:r>
+              <w:rPr>
+                <w:rFonts w:ascii="Arial" w:eastAsia="Arial" w:hAnsi="Arial" w:cs="Arial"/>
+                <w:lang w:val="pt"/>
+              </w:rPr>
+              <w:t xml:space="preserve">Descrição </w:t>
+            </w:r>
+          </w:p>
+        </w:tc>
+        <w:tc>
+          <w:tcPr>
+            <w:tcW w:w="1416" w:type="dxa"/>
+          </w:tcPr>
+          <w:p>
+            <w:pPr>
+              <w:rPr>
+                <w:rFonts w:ascii="Arial" w:eastAsia="Arial" w:hAnsi="Arial" w:cs="Arial"/>
+                <w:lang w:val="pt"/>
+              </w:rPr>
+            </w:pPr>
+            <w:r>
+              <w:rPr>
+                <w:rFonts w:ascii="Arial" w:eastAsia="Arial" w:hAnsi="Arial" w:cs="Arial"/>
+                <w:lang w:val="pt"/>
+              </w:rPr>
+              <w:t>Restrição</w:t>
+            </w:r>
+          </w:p>
+        </w:tc>
+      </w:tr>
+      <w:tr>
+        <w:tc>
+          <w:tcPr>
+            <w:tcW w:w="1415" w:type="dxa"/>
+          </w:tcPr>
+          <w:p>
+            <w:pPr>
+              <w:rPr>
+                <w:rFonts w:ascii="Arial" w:eastAsia="Arial" w:hAnsi="Arial" w:cs="Arial"/>
+                <w:lang w:val="pt"/>
+              </w:rPr>
+            </w:pPr>
+          </w:p>
+        </w:tc>
+        <w:tc>
+          <w:tcPr>
+            <w:tcW w:w="1415" w:type="dxa"/>
+          </w:tcPr>
+          <w:p>
+            <w:pPr>
+              <w:rPr>
+                <w:rFonts w:ascii="Arial" w:eastAsia="Arial" w:hAnsi="Arial" w:cs="Arial"/>
+                <w:lang w:val="pt"/>
+              </w:rPr>
+            </w:pPr>
+          </w:p>
+        </w:tc>
+        <w:tc>
+          <w:tcPr>
+            <w:tcW w:w="1416" w:type="dxa"/>
+          </w:tcPr>
+          <w:p>
+            <w:pPr>
+              <w:rPr>
+                <w:rFonts w:ascii="Arial" w:eastAsia="Arial" w:hAnsi="Arial" w:cs="Arial"/>
+                <w:lang w:val="pt"/>
+              </w:rPr>
+            </w:pPr>
+          </w:p>
+        </w:tc>
+        <w:tc>
+          <w:tcPr>
+            <w:tcW w:w="1416" w:type="dxa"/>
+          </w:tcPr>
+          <w:p>
+            <w:pPr>
+              <w:rPr>
+                <w:rFonts w:ascii="Arial" w:eastAsia="Arial" w:hAnsi="Arial" w:cs="Arial"/>
+                <w:lang w:val="pt"/>
+              </w:rPr>
+            </w:pPr>
+          </w:p>
+        </w:tc>
+        <w:tc>
+          <w:tcPr>
+            <w:tcW w:w="1416" w:type="dxa"/>
+          </w:tcPr>
+          <w:p>
+            <w:pPr>
+              <w:rPr>
+                <w:rFonts w:ascii="Arial" w:eastAsia="Arial" w:hAnsi="Arial" w:cs="Arial"/>
+                <w:lang w:val="pt"/>
+              </w:rPr>
+            </w:pPr>
+          </w:p>
+        </w:tc>
+        <w:tc>
+          <w:tcPr>
+            <w:tcW w:w="1416" w:type="dxa"/>
+          </w:tcPr>
+          <w:p>
+            <w:pPr>
+              <w:rPr>
+                <w:rFonts w:ascii="Arial" w:eastAsia="Arial" w:hAnsi="Arial" w:cs="Arial"/>
+                <w:lang w:val="pt"/>
+              </w:rPr>
+            </w:pPr>
+          </w:p>
+        </w:tc>
+      </w:tr>
+      <w:tr>
+        <w:tc>
+          <w:tcPr>
+            <w:tcW w:w="1415" w:type="dxa"/>
+          </w:tcPr>
+          <w:p>
+            <w:pPr>
+              <w:rPr>
+                <w:rFonts w:ascii="Arial" w:eastAsia="Arial" w:hAnsi="Arial" w:cs="Arial"/>
+                <w:lang w:val="pt"/>
+              </w:rPr>
+            </w:pPr>
+          </w:p>
+        </w:tc>
+        <w:tc>
+          <w:tcPr>
+            <w:tcW w:w="1415" w:type="dxa"/>
+          </w:tcPr>
+          <w:p>
+            <w:pPr>
+              <w:rPr>
+                <w:rFonts w:ascii="Arial" w:eastAsia="Arial" w:hAnsi="Arial" w:cs="Arial"/>
+                <w:lang w:val="pt"/>
+              </w:rPr>
+            </w:pPr>
+          </w:p>
+        </w:tc>
+        <w:tc>
+          <w:tcPr>
+            <w:tcW w:w="1416" w:type="dxa"/>
+          </w:tcPr>
+          <w:p>
+            <w:pPr>
+              <w:rPr>
+                <w:rFonts w:ascii="Arial" w:eastAsia="Arial" w:hAnsi="Arial" w:cs="Arial"/>
+                <w:lang w:val="pt"/>
+              </w:rPr>
+            </w:pPr>
+          </w:p>
+        </w:tc>
+        <w:tc>
+          <w:tcPr>
+            <w:tcW w:w="1416" w:type="dxa"/>
+          </w:tcPr>
+          <w:p>
+            <w:pPr>
+              <w:rPr>
+                <w:rFonts w:ascii="Arial" w:eastAsia="Arial" w:hAnsi="Arial" w:cs="Arial"/>
+                <w:lang w:val="pt"/>
+              </w:rPr>
+            </w:pPr>
+          </w:p>
+        </w:tc>
+        <w:tc>
+          <w:tcPr>
+            <w:tcW w:w="1416" w:type="dxa"/>
+          </w:tcPr>
+          <w:p>
+            <w:pPr>
+              <w:rPr>
+                <w:rFonts w:ascii="Arial" w:eastAsia="Arial" w:hAnsi="Arial" w:cs="Arial"/>
+                <w:lang w:val="pt"/>
+              </w:rPr>
+            </w:pPr>
+          </w:p>
+        </w:tc>
+        <w:tc>
+          <w:tcPr>
+            <w:tcW w:w="1416" w:type="dxa"/>
+          </w:tcPr>
+          <w:p>
+            <w:pPr>
+              <w:rPr>
+                <w:rFonts w:ascii="Arial" w:eastAsia="Arial" w:hAnsi="Arial" w:cs="Arial"/>
+                <w:lang w:val="pt"/>
+              </w:rPr>
+            </w:pPr>
+          </w:p>
+        </w:tc>
+      </w:tr>
+      <w:tr>
+        <w:tc>
+          <w:tcPr>
+            <w:tcW w:w="1415" w:type="dxa"/>
+          </w:tcPr>
+          <w:p>
+            <w:pPr>
+              <w:rPr>
+                <w:rFonts w:ascii="Arial" w:eastAsia="Arial" w:hAnsi="Arial" w:cs="Arial"/>
+                <w:lang w:val="pt"/>
+              </w:rPr>
+            </w:pPr>
+          </w:p>
+        </w:tc>
+        <w:tc>
+          <w:tcPr>
+            <w:tcW w:w="1415" w:type="dxa"/>
+          </w:tcPr>
+          <w:p>
+            <w:pPr>
+              <w:rPr>
+                <w:rFonts w:ascii="Arial" w:eastAsia="Arial" w:hAnsi="Arial" w:cs="Arial"/>
+                <w:lang w:val="pt"/>
+              </w:rPr>
+            </w:pPr>
+          </w:p>
+        </w:tc>
+        <w:tc>
+          <w:tcPr>
+            <w:tcW w:w="1416" w:type="dxa"/>
+          </w:tcPr>
+          <w:p>
+            <w:pPr>
+              <w:rPr>
+                <w:rFonts w:ascii="Arial" w:eastAsia="Arial" w:hAnsi="Arial" w:cs="Arial"/>
+                <w:lang w:val="pt"/>
+              </w:rPr>
+            </w:pPr>
+          </w:p>
+        </w:tc>
+        <w:tc>
+          <w:tcPr>
+            <w:tcW w:w="1416" w:type="dxa"/>
+          </w:tcPr>
+          <w:p>
+            <w:pPr>
+              <w:rPr>
+                <w:rFonts w:ascii="Arial" w:eastAsia="Arial" w:hAnsi="Arial" w:cs="Arial"/>
+                <w:lang w:val="pt"/>
+              </w:rPr>
+            </w:pPr>
+          </w:p>
+        </w:tc>
+        <w:tc>
+          <w:tcPr>
+            <w:tcW w:w="1416" w:type="dxa"/>
+          </w:tcPr>
+          <w:p>
+            <w:pPr>
+              <w:rPr>
+                <w:rFonts w:ascii="Arial" w:eastAsia="Arial" w:hAnsi="Arial" w:cs="Arial"/>
+                <w:lang w:val="pt"/>
+              </w:rPr>
+            </w:pPr>
+          </w:p>
+        </w:tc>
+        <w:tc>
+          <w:tcPr>
+            <w:tcW w:w="1416" w:type="dxa"/>
+          </w:tcPr>
+          <w:p>
+            <w:pPr>
+              <w:rPr>
+                <w:rFonts w:ascii="Arial" w:eastAsia="Arial" w:hAnsi="Arial" w:cs="Arial"/>
+                <w:lang w:val="pt"/>
+              </w:rPr>
+            </w:pPr>
+          </w:p>
+        </w:tc>
+      </w:tr>
+      <w:tr>
+        <w:tc>
+          <w:tcPr>
+            <w:tcW w:w="1415" w:type="dxa"/>
+          </w:tcPr>
+          <w:p>
+            <w:pPr>
+              <w:rPr>
+                <w:rFonts w:ascii="Arial" w:eastAsia="Arial" w:hAnsi="Arial" w:cs="Arial"/>
+                <w:lang w:val="pt"/>
+              </w:rPr>
+            </w:pPr>
+          </w:p>
+        </w:tc>
+        <w:tc>
+          <w:tcPr>
+            <w:tcW w:w="1415" w:type="dxa"/>
+          </w:tcPr>
+          <w:p>
+            <w:pPr>
+              <w:rPr>
+                <w:rFonts w:ascii="Arial" w:eastAsia="Arial" w:hAnsi="Arial" w:cs="Arial"/>
+                <w:lang w:val="pt"/>
+              </w:rPr>
+            </w:pPr>
+          </w:p>
+        </w:tc>
+        <w:tc>
+          <w:tcPr>
+            <w:tcW w:w="1416" w:type="dxa"/>
+          </w:tcPr>
+          <w:p>
+            <w:pPr>
+              <w:rPr>
+                <w:rFonts w:ascii="Arial" w:eastAsia="Arial" w:hAnsi="Arial" w:cs="Arial"/>
+                <w:lang w:val="pt"/>
+              </w:rPr>
+            </w:pPr>
+          </w:p>
+        </w:tc>
+        <w:tc>
+          <w:tcPr>
+            <w:tcW w:w="1416" w:type="dxa"/>
+          </w:tcPr>
+          <w:p>
+            <w:pPr>
+              <w:rPr>
+                <w:rFonts w:ascii="Arial" w:eastAsia="Arial" w:hAnsi="Arial" w:cs="Arial"/>
+                <w:lang w:val="pt"/>
+              </w:rPr>
+            </w:pPr>
+          </w:p>
+        </w:tc>
+        <w:tc>
+          <w:tcPr>
+            <w:tcW w:w="1416" w:type="dxa"/>
+          </w:tcPr>
+          <w:p>
+            <w:pPr>
+              <w:rPr>
+                <w:rFonts w:ascii="Arial" w:eastAsia="Arial" w:hAnsi="Arial" w:cs="Arial"/>
+                <w:lang w:val="pt"/>
+              </w:rPr>
+            </w:pPr>
+          </w:p>
+        </w:tc>
+        <w:tc>
+          <w:tcPr>
+            <w:tcW w:w="1416" w:type="dxa"/>
+          </w:tcPr>
+          <w:p>
+            <w:pPr>
+              <w:rPr>
+                <w:rFonts w:ascii="Arial" w:eastAsia="Arial" w:hAnsi="Arial" w:cs="Arial"/>
+                <w:lang w:val="pt"/>
+              </w:rPr>
+            </w:pPr>
+          </w:p>
+        </w:tc>
+      </w:tr>
+      <w:tr>
+        <w:tc>
+          <w:tcPr>
+            <w:tcW w:w="1415" w:type="dxa"/>
+          </w:tcPr>
+          <w:p>
+            <w:pPr>
+              <w:rPr>
+                <w:rFonts w:ascii="Arial" w:eastAsia="Arial" w:hAnsi="Arial" w:cs="Arial"/>
+                <w:lang w:val="pt"/>
+              </w:rPr>
+            </w:pPr>
+          </w:p>
+        </w:tc>
+        <w:tc>
+          <w:tcPr>
+            <w:tcW w:w="1415" w:type="dxa"/>
+          </w:tcPr>
+          <w:p>
+            <w:pPr>
+              <w:rPr>
+                <w:rFonts w:ascii="Arial" w:eastAsia="Arial" w:hAnsi="Arial" w:cs="Arial"/>
+                <w:lang w:val="pt"/>
+              </w:rPr>
+            </w:pPr>
+          </w:p>
+        </w:tc>
+        <w:tc>
+          <w:tcPr>
+            <w:tcW w:w="1416" w:type="dxa"/>
+          </w:tcPr>
+          <w:p>
+            <w:pPr>
+              <w:rPr>
+                <w:rFonts w:ascii="Arial" w:eastAsia="Arial" w:hAnsi="Arial" w:cs="Arial"/>
+                <w:lang w:val="pt"/>
+              </w:rPr>
+            </w:pPr>
+          </w:p>
+        </w:tc>
+        <w:tc>
+          <w:tcPr>
+            <w:tcW w:w="1416" w:type="dxa"/>
+          </w:tcPr>
+          <w:p>
+            <w:pPr>
+              <w:rPr>
+                <w:rFonts w:ascii="Arial" w:eastAsia="Arial" w:hAnsi="Arial" w:cs="Arial"/>
+                <w:lang w:val="pt"/>
+              </w:rPr>
+            </w:pPr>
+          </w:p>
+        </w:tc>
+        <w:tc>
+          <w:tcPr>
+            <w:tcW w:w="1416" w:type="dxa"/>
+          </w:tcPr>
+          <w:p>
+            <w:pPr>
+              <w:rPr>
+                <w:rFonts w:ascii="Arial" w:eastAsia="Arial" w:hAnsi="Arial" w:cs="Arial"/>
+                <w:lang w:val="pt"/>
+              </w:rPr>
+            </w:pPr>
+          </w:p>
+        </w:tc>
+        <w:tc>
+          <w:tcPr>
+            <w:tcW w:w="1416" w:type="dxa"/>
+          </w:tcPr>
+          <w:p>
+            <w:pPr>
+              <w:rPr>
+                <w:rFonts w:ascii="Arial" w:eastAsia="Arial" w:hAnsi="Arial" w:cs="Arial"/>
+                <w:lang w:val="pt"/>
+              </w:rPr>
+            </w:pPr>
+          </w:p>
+        </w:tc>
+      </w:tr>
+    </w:tbl>
+    <w:p>
+      <w:pPr>
+        <w:rPr>
+          <w:rFonts w:ascii="Arial" w:eastAsia="Arial" w:hAnsi="Arial" w:cs="Arial"/>
+          <w:lang w:val="pt"/>
+        </w:rPr>
+      </w:pPr>
+    </w:p>
+    <w:p>
+      <w:pPr>
+        <w:rPr>
+          <w:rFonts w:ascii="Arial" w:eastAsia="Arial" w:hAnsi="Arial" w:cs="Arial"/>
+          <w:lang w:val="pt"/>
+        </w:rPr>
+      </w:pPr>
+    </w:p>
+    <w:p>
+      <w:pPr>
+        <w:rPr>
+          <w:rFonts w:ascii="Arial" w:eastAsia="Arial" w:hAnsi="Arial" w:cs="Arial"/>
+          <w:lang w:val="pt"/>
+        </w:rPr>
+      </w:pPr>
+      <w:r>
+        <w:rPr>
+          <w:rFonts w:ascii="Arial" w:eastAsia="Arial" w:hAnsi="Arial" w:cs="Arial"/>
+          <w:lang w:val="pt"/>
+        </w:rPr>
+        <w:t xml:space="preserve">Dicionário </w:t>
+      </w:r>
+      <w:r>
+        <w:rPr>
+          <w:rFonts w:ascii="Arial" w:eastAsia="Arial" w:hAnsi="Arial" w:cs="Arial"/>
+          <w:lang w:val="pt"/>
+        </w:rPr>
+        <w:t>–</w:t>
+      </w:r>
+      <w:r>
+        <w:rPr>
+          <w:rFonts w:ascii="Arial" w:eastAsia="Arial" w:hAnsi="Arial" w:cs="Arial"/>
+          <w:lang w:val="pt"/>
+        </w:rPr>
+        <w:t xml:space="preserve"> Compra</w:t>
+      </w:r>
+    </w:p>
+    <w:tbl>
+      <w:tblPr>
+        <w:tblStyle w:val="Tabelacomgrade"/>
+        <w:tblW w:w="0" w:type="auto"/>
+        <w:tblLook w:val="04A0" w:firstRow="1" w:lastRow="0" w:firstColumn="1" w:lastColumn="0" w:noHBand="0" w:noVBand="1"/>
+      </w:tblPr>
+      <w:tblGrid>
+        <w:gridCol w:w="1415"/>
+        <w:gridCol w:w="1415"/>
+        <w:gridCol w:w="1416"/>
+        <w:gridCol w:w="1416"/>
+        <w:gridCol w:w="1416"/>
+        <w:gridCol w:w="1416"/>
+      </w:tblGrid>
+      <w:tr>
+        <w:tc>
+          <w:tcPr>
+            <w:tcW w:w="1415" w:type="dxa"/>
+          </w:tcPr>
+          <w:p>
+            <w:pPr>
+              <w:rPr>
+                <w:rFonts w:ascii="Arial" w:eastAsia="Arial" w:hAnsi="Arial" w:cs="Arial"/>
+                <w:lang w:val="pt"/>
+              </w:rPr>
+            </w:pPr>
+            <w:r>
+              <w:rPr>
+                <w:rFonts w:ascii="Arial" w:eastAsia="Arial" w:hAnsi="Arial" w:cs="Arial"/>
+                <w:lang w:val="pt"/>
+              </w:rPr>
+              <w:t>Atributo</w:t>
+            </w:r>
+          </w:p>
+        </w:tc>
+        <w:tc>
+          <w:tcPr>
+            <w:tcW w:w="1415" w:type="dxa"/>
+          </w:tcPr>
+          <w:p>
+            <w:pPr>
+              <w:rPr>
+                <w:rFonts w:ascii="Arial" w:eastAsia="Arial" w:hAnsi="Arial" w:cs="Arial"/>
+                <w:lang w:val="pt"/>
+              </w:rPr>
+            </w:pPr>
+            <w:r>
+              <w:rPr>
+                <w:rFonts w:ascii="Arial" w:eastAsia="Arial" w:hAnsi="Arial" w:cs="Arial"/>
+                <w:lang w:val="pt"/>
+              </w:rPr>
+              <w:t>Campo</w:t>
+            </w:r>
+          </w:p>
+        </w:tc>
+        <w:tc>
+          <w:tcPr>
+            <w:tcW w:w="1416" w:type="dxa"/>
+          </w:tcPr>
+          <w:p>
+            <w:pPr>
+              <w:rPr>
+                <w:rFonts w:ascii="Arial" w:eastAsia="Arial" w:hAnsi="Arial" w:cs="Arial"/>
+                <w:lang w:val="pt"/>
+              </w:rPr>
+            </w:pPr>
+            <w:r>
+              <w:rPr>
+                <w:rFonts w:ascii="Arial" w:eastAsia="Arial" w:hAnsi="Arial" w:cs="Arial"/>
+                <w:lang w:val="pt"/>
+              </w:rPr>
+              <w:t>Tipo de dados</w:t>
+            </w:r>
+          </w:p>
+        </w:tc>
+        <w:tc>
+          <w:tcPr>
+            <w:tcW w:w="1416" w:type="dxa"/>
+          </w:tcPr>
+          <w:p>
+            <w:pPr>
+              <w:rPr>
+                <w:rFonts w:ascii="Arial" w:eastAsia="Arial" w:hAnsi="Arial" w:cs="Arial"/>
+                <w:lang w:val="pt"/>
+              </w:rPr>
+            </w:pPr>
+            <w:r>
+              <w:rPr>
+                <w:rFonts w:ascii="Arial" w:eastAsia="Arial" w:hAnsi="Arial" w:cs="Arial"/>
+                <w:lang w:val="pt"/>
+              </w:rPr>
+              <w:t>Tamanho</w:t>
+            </w:r>
+          </w:p>
+        </w:tc>
+        <w:tc>
+          <w:tcPr>
+            <w:tcW w:w="1416" w:type="dxa"/>
+          </w:tcPr>
+          <w:p>
+            <w:pPr>
+              <w:rPr>
+                <w:rFonts w:ascii="Arial" w:eastAsia="Arial" w:hAnsi="Arial" w:cs="Arial"/>
+                <w:lang w:val="pt"/>
+              </w:rPr>
+            </w:pPr>
+            <w:r>
+              <w:rPr>
+                <w:rFonts w:ascii="Arial" w:eastAsia="Arial" w:hAnsi="Arial" w:cs="Arial"/>
+                <w:lang w:val="pt"/>
+              </w:rPr>
+              <w:t xml:space="preserve">Descrição </w:t>
+            </w:r>
+          </w:p>
+        </w:tc>
+        <w:tc>
+          <w:tcPr>
+            <w:tcW w:w="1416" w:type="dxa"/>
+          </w:tcPr>
+          <w:p>
+            <w:pPr>
+              <w:rPr>
+                <w:rFonts w:ascii="Arial" w:eastAsia="Arial" w:hAnsi="Arial" w:cs="Arial"/>
+                <w:lang w:val="pt"/>
+              </w:rPr>
+            </w:pPr>
+            <w:proofErr w:type="spellStart"/>
+            <w:r>
+              <w:rPr>
+                <w:rFonts w:ascii="Arial" w:eastAsia="Arial" w:hAnsi="Arial" w:cs="Arial"/>
+                <w:lang w:val="pt"/>
+              </w:rPr>
+              <w:t>Restriçao</w:t>
+            </w:r>
+            <w:proofErr w:type="spellEnd"/>
+          </w:p>
+        </w:tc>
+      </w:tr>
+      <w:tr>
+        <w:tc>
+          <w:tcPr>
+            <w:tcW w:w="1415" w:type="dxa"/>
+          </w:tcPr>
+          <w:p>
+            <w:pPr>
+              <w:rPr>
+                <w:rFonts w:ascii="Arial" w:eastAsia="Arial" w:hAnsi="Arial" w:cs="Arial"/>
+                <w:lang w:val="pt"/>
+              </w:rPr>
+            </w:pPr>
+          </w:p>
+        </w:tc>
+        <w:tc>
+          <w:tcPr>
+            <w:tcW w:w="1415" w:type="dxa"/>
+          </w:tcPr>
+          <w:p>
+            <w:pPr>
+              <w:rPr>
+                <w:rFonts w:ascii="Arial" w:eastAsia="Arial" w:hAnsi="Arial" w:cs="Arial"/>
+                <w:lang w:val="pt"/>
+              </w:rPr>
+            </w:pPr>
+          </w:p>
+        </w:tc>
+        <w:tc>
+          <w:tcPr>
+            <w:tcW w:w="1416" w:type="dxa"/>
+          </w:tcPr>
+          <w:p>
+            <w:pPr>
+              <w:rPr>
+                <w:rFonts w:ascii="Arial" w:eastAsia="Arial" w:hAnsi="Arial" w:cs="Arial"/>
+                <w:lang w:val="pt"/>
+              </w:rPr>
+            </w:pPr>
+          </w:p>
+        </w:tc>
+        <w:tc>
+          <w:tcPr>
+            <w:tcW w:w="1416" w:type="dxa"/>
+          </w:tcPr>
+          <w:p>
+            <w:pPr>
+              <w:rPr>
+                <w:rFonts w:ascii="Arial" w:eastAsia="Arial" w:hAnsi="Arial" w:cs="Arial"/>
+                <w:lang w:val="pt"/>
+              </w:rPr>
+            </w:pPr>
+          </w:p>
+        </w:tc>
+        <w:tc>
+          <w:tcPr>
+            <w:tcW w:w="1416" w:type="dxa"/>
+          </w:tcPr>
+          <w:p>
+            <w:pPr>
+              <w:rPr>
+                <w:rFonts w:ascii="Arial" w:eastAsia="Arial" w:hAnsi="Arial" w:cs="Arial"/>
+                <w:lang w:val="pt"/>
+              </w:rPr>
+            </w:pPr>
+          </w:p>
+        </w:tc>
+        <w:tc>
+          <w:tcPr>
+            <w:tcW w:w="1416" w:type="dxa"/>
+          </w:tcPr>
+          <w:p>
+            <w:pPr>
+              <w:rPr>
+                <w:rFonts w:ascii="Arial" w:eastAsia="Arial" w:hAnsi="Arial" w:cs="Arial"/>
+                <w:lang w:val="pt"/>
+              </w:rPr>
+            </w:pPr>
+          </w:p>
+        </w:tc>
+      </w:tr>
+      <w:tr>
+        <w:tc>
+          <w:tcPr>
+            <w:tcW w:w="1415" w:type="dxa"/>
+          </w:tcPr>
+          <w:p>
+            <w:pPr>
+              <w:rPr>
+                <w:rFonts w:ascii="Arial" w:eastAsia="Arial" w:hAnsi="Arial" w:cs="Arial"/>
+                <w:lang w:val="pt"/>
+              </w:rPr>
+            </w:pPr>
+          </w:p>
+        </w:tc>
+        <w:tc>
+          <w:tcPr>
+            <w:tcW w:w="1415" w:type="dxa"/>
+          </w:tcPr>
+          <w:p>
+            <w:pPr>
+              <w:rPr>
+                <w:rFonts w:ascii="Arial" w:eastAsia="Arial" w:hAnsi="Arial" w:cs="Arial"/>
+                <w:lang w:val="pt"/>
+              </w:rPr>
+            </w:pPr>
+          </w:p>
+        </w:tc>
+        <w:tc>
+          <w:tcPr>
+            <w:tcW w:w="1416" w:type="dxa"/>
+          </w:tcPr>
+          <w:p>
+            <w:pPr>
+              <w:rPr>
+                <w:rFonts w:ascii="Arial" w:eastAsia="Arial" w:hAnsi="Arial" w:cs="Arial"/>
+                <w:lang w:val="pt"/>
+              </w:rPr>
+            </w:pPr>
+          </w:p>
+        </w:tc>
+        <w:tc>
+          <w:tcPr>
+            <w:tcW w:w="1416" w:type="dxa"/>
+          </w:tcPr>
+          <w:p>
+            <w:pPr>
+              <w:rPr>
+                <w:rFonts w:ascii="Arial" w:eastAsia="Arial" w:hAnsi="Arial" w:cs="Arial"/>
+                <w:lang w:val="pt"/>
+              </w:rPr>
+            </w:pPr>
+          </w:p>
+        </w:tc>
+        <w:tc>
+          <w:tcPr>
+            <w:tcW w:w="1416" w:type="dxa"/>
+          </w:tcPr>
+          <w:p>
+            <w:pPr>
+              <w:rPr>
+                <w:rFonts w:ascii="Arial" w:eastAsia="Arial" w:hAnsi="Arial" w:cs="Arial"/>
+                <w:lang w:val="pt"/>
+              </w:rPr>
+            </w:pPr>
+          </w:p>
+        </w:tc>
+        <w:tc>
+          <w:tcPr>
+            <w:tcW w:w="1416" w:type="dxa"/>
+          </w:tcPr>
+          <w:p>
+            <w:pPr>
+              <w:rPr>
+                <w:rFonts w:ascii="Arial" w:eastAsia="Arial" w:hAnsi="Arial" w:cs="Arial"/>
+                <w:lang w:val="pt"/>
+              </w:rPr>
+            </w:pPr>
+          </w:p>
+        </w:tc>
+      </w:tr>
+      <w:tr>
+        <w:tc>
+          <w:tcPr>
+            <w:tcW w:w="1415" w:type="dxa"/>
+          </w:tcPr>
+          <w:p>
+            <w:pPr>
+              <w:rPr>
+                <w:rFonts w:ascii="Arial" w:eastAsia="Arial" w:hAnsi="Arial" w:cs="Arial"/>
+                <w:lang w:val="pt"/>
+              </w:rPr>
+            </w:pPr>
+          </w:p>
+        </w:tc>
+        <w:tc>
+          <w:tcPr>
+            <w:tcW w:w="1415" w:type="dxa"/>
+          </w:tcPr>
+          <w:p>
+            <w:pPr>
+              <w:rPr>
+                <w:rFonts w:ascii="Arial" w:eastAsia="Arial" w:hAnsi="Arial" w:cs="Arial"/>
+                <w:lang w:val="pt"/>
+              </w:rPr>
+            </w:pPr>
+          </w:p>
+        </w:tc>
+        <w:tc>
+          <w:tcPr>
+            <w:tcW w:w="1416" w:type="dxa"/>
+          </w:tcPr>
+          <w:p>
+            <w:pPr>
+              <w:rPr>
+                <w:rFonts w:ascii="Arial" w:eastAsia="Arial" w:hAnsi="Arial" w:cs="Arial"/>
+                <w:lang w:val="pt"/>
+              </w:rPr>
+            </w:pPr>
+          </w:p>
+        </w:tc>
+        <w:tc>
+          <w:tcPr>
+            <w:tcW w:w="1416" w:type="dxa"/>
+          </w:tcPr>
+          <w:p>
+            <w:pPr>
+              <w:rPr>
+                <w:rFonts w:ascii="Arial" w:eastAsia="Arial" w:hAnsi="Arial" w:cs="Arial"/>
+                <w:lang w:val="pt"/>
+              </w:rPr>
+            </w:pPr>
+          </w:p>
+        </w:tc>
+        <w:tc>
+          <w:tcPr>
+            <w:tcW w:w="1416" w:type="dxa"/>
+          </w:tcPr>
+          <w:p>
+            <w:pPr>
+              <w:rPr>
+                <w:rFonts w:ascii="Arial" w:eastAsia="Arial" w:hAnsi="Arial" w:cs="Arial"/>
+                <w:lang w:val="pt"/>
+              </w:rPr>
+            </w:pPr>
+          </w:p>
+        </w:tc>
+        <w:tc>
+          <w:tcPr>
+            <w:tcW w:w="1416" w:type="dxa"/>
+          </w:tcPr>
+          <w:p>
+            <w:pPr>
+              <w:rPr>
+                <w:rFonts w:ascii="Arial" w:eastAsia="Arial" w:hAnsi="Arial" w:cs="Arial"/>
+                <w:lang w:val="pt"/>
+              </w:rPr>
+            </w:pPr>
+          </w:p>
+        </w:tc>
+      </w:tr>
+      <w:tr>
+        <w:tc>
+          <w:tcPr>
+            <w:tcW w:w="1415" w:type="dxa"/>
+          </w:tcPr>
+          <w:p>
+            <w:pPr>
+              <w:rPr>
+                <w:rFonts w:ascii="Arial" w:eastAsia="Arial" w:hAnsi="Arial" w:cs="Arial"/>
+                <w:lang w:val="pt"/>
+              </w:rPr>
+            </w:pPr>
+          </w:p>
+        </w:tc>
+        <w:tc>
+          <w:tcPr>
+            <w:tcW w:w="1415" w:type="dxa"/>
+          </w:tcPr>
+          <w:p>
+            <w:pPr>
+              <w:rPr>
+                <w:rFonts w:ascii="Arial" w:eastAsia="Arial" w:hAnsi="Arial" w:cs="Arial"/>
+                <w:lang w:val="pt"/>
+              </w:rPr>
+            </w:pPr>
+          </w:p>
+        </w:tc>
+        <w:tc>
+          <w:tcPr>
+            <w:tcW w:w="1416" w:type="dxa"/>
+          </w:tcPr>
+          <w:p>
+            <w:pPr>
+              <w:rPr>
+                <w:rFonts w:ascii="Arial" w:eastAsia="Arial" w:hAnsi="Arial" w:cs="Arial"/>
+                <w:lang w:val="pt"/>
+              </w:rPr>
+            </w:pPr>
+          </w:p>
+        </w:tc>
+        <w:tc>
+          <w:tcPr>
+            <w:tcW w:w="1416" w:type="dxa"/>
+          </w:tcPr>
+          <w:p>
+            <w:pPr>
+              <w:rPr>
+                <w:rFonts w:ascii="Arial" w:eastAsia="Arial" w:hAnsi="Arial" w:cs="Arial"/>
+                <w:lang w:val="pt"/>
+              </w:rPr>
+            </w:pPr>
+          </w:p>
+        </w:tc>
+        <w:tc>
+          <w:tcPr>
+            <w:tcW w:w="1416" w:type="dxa"/>
+          </w:tcPr>
+          <w:p>
+            <w:pPr>
+              <w:rPr>
+                <w:rFonts w:ascii="Arial" w:eastAsia="Arial" w:hAnsi="Arial" w:cs="Arial"/>
+                <w:lang w:val="pt"/>
+              </w:rPr>
+            </w:pPr>
+          </w:p>
+        </w:tc>
+        <w:tc>
+          <w:tcPr>
+            <w:tcW w:w="1416" w:type="dxa"/>
+          </w:tcPr>
+          <w:p>
+            <w:pPr>
+              <w:rPr>
+                <w:rFonts w:ascii="Arial" w:eastAsia="Arial" w:hAnsi="Arial" w:cs="Arial"/>
+                <w:lang w:val="pt"/>
+              </w:rPr>
+            </w:pPr>
+          </w:p>
+        </w:tc>
+      </w:tr>
+      <w:tr>
+        <w:tc>
+          <w:tcPr>
+            <w:tcW w:w="1415" w:type="dxa"/>
+          </w:tcPr>
+          <w:p>
+            <w:pPr>
+              <w:rPr>
+                <w:rFonts w:ascii="Arial" w:eastAsia="Arial" w:hAnsi="Arial" w:cs="Arial"/>
+                <w:lang w:val="pt"/>
+              </w:rPr>
+            </w:pPr>
+          </w:p>
+        </w:tc>
+        <w:tc>
+          <w:tcPr>
+            <w:tcW w:w="1415" w:type="dxa"/>
+          </w:tcPr>
+          <w:p>
+            <w:pPr>
+              <w:rPr>
+                <w:rFonts w:ascii="Arial" w:eastAsia="Arial" w:hAnsi="Arial" w:cs="Arial"/>
+                <w:lang w:val="pt"/>
+              </w:rPr>
+            </w:pPr>
+          </w:p>
+        </w:tc>
+        <w:tc>
+          <w:tcPr>
+            <w:tcW w:w="1416" w:type="dxa"/>
+          </w:tcPr>
+          <w:p>
+            <w:pPr>
+              <w:rPr>
+                <w:rFonts w:ascii="Arial" w:eastAsia="Arial" w:hAnsi="Arial" w:cs="Arial"/>
+                <w:lang w:val="pt"/>
+              </w:rPr>
+            </w:pPr>
+          </w:p>
+        </w:tc>
+        <w:tc>
+          <w:tcPr>
+            <w:tcW w:w="1416" w:type="dxa"/>
+          </w:tcPr>
+          <w:p>
+            <w:pPr>
+              <w:rPr>
+                <w:rFonts w:ascii="Arial" w:eastAsia="Arial" w:hAnsi="Arial" w:cs="Arial"/>
+                <w:lang w:val="pt"/>
+              </w:rPr>
+            </w:pPr>
+          </w:p>
+        </w:tc>
+        <w:tc>
+          <w:tcPr>
+            <w:tcW w:w="1416" w:type="dxa"/>
+          </w:tcPr>
+          <w:p>
+            <w:pPr>
+              <w:rPr>
+                <w:rFonts w:ascii="Arial" w:eastAsia="Arial" w:hAnsi="Arial" w:cs="Arial"/>
+                <w:lang w:val="pt"/>
+              </w:rPr>
+            </w:pPr>
+          </w:p>
+        </w:tc>
+        <w:tc>
+          <w:tcPr>
+            <w:tcW w:w="1416" w:type="dxa"/>
+          </w:tcPr>
+          <w:p>
+            <w:pPr>
+              <w:rPr>
+                <w:rFonts w:ascii="Arial" w:eastAsia="Arial" w:hAnsi="Arial" w:cs="Arial"/>
+                <w:lang w:val="pt"/>
+              </w:rPr>
+            </w:pPr>
+          </w:p>
+        </w:tc>
+      </w:tr>
+      <w:tr>
+        <w:tc>
+          <w:tcPr>
+            <w:tcW w:w="1415" w:type="dxa"/>
+          </w:tcPr>
+          <w:p>
+            <w:pPr>
+              <w:rPr>
+                <w:rFonts w:ascii="Arial" w:eastAsia="Arial" w:hAnsi="Arial" w:cs="Arial"/>
+                <w:lang w:val="pt"/>
+              </w:rPr>
+            </w:pPr>
+          </w:p>
+        </w:tc>
+        <w:tc>
+          <w:tcPr>
+            <w:tcW w:w="1415" w:type="dxa"/>
+          </w:tcPr>
+          <w:p>
+            <w:pPr>
+              <w:rPr>
+                <w:rFonts w:ascii="Arial" w:eastAsia="Arial" w:hAnsi="Arial" w:cs="Arial"/>
+                <w:lang w:val="pt"/>
+              </w:rPr>
+            </w:pPr>
+          </w:p>
+        </w:tc>
+        <w:tc>
+          <w:tcPr>
+            <w:tcW w:w="1416" w:type="dxa"/>
+          </w:tcPr>
+          <w:p>
+            <w:pPr>
+              <w:rPr>
+                <w:rFonts w:ascii="Arial" w:eastAsia="Arial" w:hAnsi="Arial" w:cs="Arial"/>
+                <w:lang w:val="pt"/>
+              </w:rPr>
+            </w:pPr>
+          </w:p>
+        </w:tc>
+        <w:tc>
+          <w:tcPr>
+            <w:tcW w:w="1416" w:type="dxa"/>
+          </w:tcPr>
+          <w:p>
+            <w:pPr>
+              <w:rPr>
+                <w:rFonts w:ascii="Arial" w:eastAsia="Arial" w:hAnsi="Arial" w:cs="Arial"/>
+                <w:lang w:val="pt"/>
+              </w:rPr>
+            </w:pPr>
+          </w:p>
+        </w:tc>
+        <w:tc>
+          <w:tcPr>
+            <w:tcW w:w="1416" w:type="dxa"/>
+          </w:tcPr>
+          <w:p>
+            <w:pPr>
+              <w:rPr>
+                <w:rFonts w:ascii="Arial" w:eastAsia="Arial" w:hAnsi="Arial" w:cs="Arial"/>
+                <w:lang w:val="pt"/>
+              </w:rPr>
+            </w:pPr>
+          </w:p>
+        </w:tc>
+        <w:tc>
+          <w:tcPr>
+            <w:tcW w:w="1416" w:type="dxa"/>
+          </w:tcPr>
+          <w:p>
+            <w:pPr>
+              <w:rPr>
+                <w:rFonts w:ascii="Arial" w:eastAsia="Arial" w:hAnsi="Arial" w:cs="Arial"/>
+                <w:lang w:val="pt"/>
+              </w:rPr>
+            </w:pPr>
+          </w:p>
+        </w:tc>
+      </w:tr>
+      <w:tr>
+        <w:tc>
+          <w:tcPr>
+            <w:tcW w:w="1415" w:type="dxa"/>
+          </w:tcPr>
+          <w:p>
+            <w:pPr>
+              <w:rPr>
+                <w:rFonts w:ascii="Arial" w:eastAsia="Arial" w:hAnsi="Arial" w:cs="Arial"/>
+                <w:lang w:val="pt"/>
+              </w:rPr>
+            </w:pPr>
+          </w:p>
+        </w:tc>
+        <w:tc>
+          <w:tcPr>
+            <w:tcW w:w="1415" w:type="dxa"/>
+          </w:tcPr>
+          <w:p>
+            <w:pPr>
+              <w:rPr>
+                <w:rFonts w:ascii="Arial" w:eastAsia="Arial" w:hAnsi="Arial" w:cs="Arial"/>
+                <w:lang w:val="pt"/>
+              </w:rPr>
+            </w:pPr>
+          </w:p>
+        </w:tc>
+        <w:tc>
+          <w:tcPr>
+            <w:tcW w:w="1416" w:type="dxa"/>
+          </w:tcPr>
+          <w:p>
+            <w:pPr>
+              <w:rPr>
+                <w:rFonts w:ascii="Arial" w:eastAsia="Arial" w:hAnsi="Arial" w:cs="Arial"/>
+                <w:lang w:val="pt"/>
+              </w:rPr>
+            </w:pPr>
+          </w:p>
+        </w:tc>
+        <w:tc>
+          <w:tcPr>
+            <w:tcW w:w="1416" w:type="dxa"/>
+          </w:tcPr>
+          <w:p>
+            <w:pPr>
+              <w:rPr>
+                <w:rFonts w:ascii="Arial" w:eastAsia="Arial" w:hAnsi="Arial" w:cs="Arial"/>
+                <w:lang w:val="pt"/>
+              </w:rPr>
+            </w:pPr>
+          </w:p>
+        </w:tc>
+        <w:tc>
+          <w:tcPr>
+            <w:tcW w:w="1416" w:type="dxa"/>
+          </w:tcPr>
+          <w:p>
+            <w:pPr>
+              <w:rPr>
+                <w:rFonts w:ascii="Arial" w:eastAsia="Arial" w:hAnsi="Arial" w:cs="Arial"/>
+                <w:lang w:val="pt"/>
+              </w:rPr>
+            </w:pPr>
+          </w:p>
+        </w:tc>
+        <w:tc>
+          <w:tcPr>
+            <w:tcW w:w="1416" w:type="dxa"/>
+          </w:tcPr>
+          <w:p>
+            <w:pPr>
+              <w:rPr>
+                <w:rFonts w:ascii="Arial" w:eastAsia="Arial" w:hAnsi="Arial" w:cs="Arial"/>
+                <w:lang w:val="pt"/>
+              </w:rPr>
+            </w:pPr>
+          </w:p>
+        </w:tc>
+      </w:tr>
+      <w:tr>
+        <w:tc>
+          <w:tcPr>
+            <w:tcW w:w="1415" w:type="dxa"/>
+          </w:tcPr>
+          <w:p>
+            <w:pPr>
+              <w:rPr>
+                <w:rFonts w:ascii="Arial" w:eastAsia="Arial" w:hAnsi="Arial" w:cs="Arial"/>
+                <w:lang w:val="pt"/>
+              </w:rPr>
+            </w:pPr>
+          </w:p>
+        </w:tc>
+        <w:tc>
+          <w:tcPr>
+            <w:tcW w:w="1415" w:type="dxa"/>
+          </w:tcPr>
+          <w:p>
+            <w:pPr>
+              <w:rPr>
+                <w:rFonts w:ascii="Arial" w:eastAsia="Arial" w:hAnsi="Arial" w:cs="Arial"/>
+                <w:lang w:val="pt"/>
+              </w:rPr>
+            </w:pPr>
+          </w:p>
+        </w:tc>
+        <w:tc>
+          <w:tcPr>
+            <w:tcW w:w="1416" w:type="dxa"/>
+          </w:tcPr>
+          <w:p>
+            <w:pPr>
+              <w:rPr>
+                <w:rFonts w:ascii="Arial" w:eastAsia="Arial" w:hAnsi="Arial" w:cs="Arial"/>
+                <w:lang w:val="pt"/>
+              </w:rPr>
+            </w:pPr>
+          </w:p>
+        </w:tc>
+        <w:tc>
+          <w:tcPr>
+            <w:tcW w:w="1416" w:type="dxa"/>
+          </w:tcPr>
+          <w:p>
+            <w:pPr>
+              <w:rPr>
+                <w:rFonts w:ascii="Arial" w:eastAsia="Arial" w:hAnsi="Arial" w:cs="Arial"/>
+                <w:lang w:val="pt"/>
+              </w:rPr>
+            </w:pPr>
+          </w:p>
+        </w:tc>
+        <w:tc>
+          <w:tcPr>
+            <w:tcW w:w="1416" w:type="dxa"/>
+          </w:tcPr>
+          <w:p>
+            <w:pPr>
+              <w:rPr>
+                <w:rFonts w:ascii="Arial" w:eastAsia="Arial" w:hAnsi="Arial" w:cs="Arial"/>
+                <w:lang w:val="pt"/>
+              </w:rPr>
+            </w:pPr>
+          </w:p>
+        </w:tc>
+        <w:tc>
+          <w:tcPr>
+            <w:tcW w:w="1416" w:type="dxa"/>
+          </w:tcPr>
+          <w:p>
+            <w:pPr>
+              <w:rPr>
+                <w:rFonts w:ascii="Arial" w:eastAsia="Arial" w:hAnsi="Arial" w:cs="Arial"/>
+                <w:lang w:val="pt"/>
+              </w:rPr>
+            </w:pPr>
+          </w:p>
+        </w:tc>
+      </w:tr>
+    </w:tbl>
     <w:p>
       <w:pPr>
         <w:rPr>
@@ -1799,6 +4740,25 @@
       <w:spacing w:val="5"/>
     </w:rPr>
   </w:style>
+  <w:style w:type="table" w:styleId="Tabelacomgrade">
+    <w:name w:val="Table Grid"/>
+    <w:basedOn w:val="Tabelanormal"/>
+    <w:uiPriority w:val="39"/>
+    <w:rsid w:val="00EF405C"/>
+    <w:pPr>
+      <w:spacing w:after="0" w:line="240" w:lineRule="auto"/>
+    </w:pPr>
+    <w:tblPr>
+      <w:tblBorders>
+        <w:top w:val="single" w:sz="4" w:space="0" w:color="auto"/>
+        <w:left w:val="single" w:sz="4" w:space="0" w:color="auto"/>
+        <w:bottom w:val="single" w:sz="4" w:space="0" w:color="auto"/>
+        <w:right w:val="single" w:sz="4" w:space="0" w:color="auto"/>
+        <w:insideH w:val="single" w:sz="4" w:space="0" w:color="auto"/>
+        <w:insideV w:val="single" w:sz="4" w:space="0" w:color="auto"/>
+      </w:tblBorders>
+    </w:tblPr>
+  </w:style>
 </w:styles>
 </file>
 

</xml_diff>